<commit_message>
docs: 2FA por SMS, cadastro em etapas, celular único e sessão encerrada
- monografia (histórico 1.16): RF01, RF06, RNF12, RNF16, RN01, pacotes,
  heurísticas, sistema distribuído, componentes e resultados dos testes
- apêndice C: fluxos de cadastro em etapas, login com SMS, ativação do SMS
  e sessão encerrada ao excluir ou inativar a conta
- apêndice D: mfa_sms_phone e unicidade de phone_number no dicionário e no DER
- apêndice I: celular gateway de SMS como serviço externo
- apêndice J: casos CT39 a CT47 e bateria com 354 testes
- apêndice K: manual com o cadastro em etapas (nova Figura 1) e o MFA por SMS
</commit_message>
<xml_diff>
--- a/ApêndiceC-VisãoFuncional/3.FluxosdeEvento/FalaCidade_FluxosDeEventos_ModuloAdministrarConta_v2.docx
+++ b/ApêndiceC-VisãoFuncional/3.FluxosdeEvento/FalaCidade_FluxosDeEventos_ModuloAdministrarConta_v2.docx
@@ -1048,6 +1048,49 @@
           </w:p>
         </w:tc>
       </w:tr>
+      <w:tr>
+        <w:tc>
+          <w:tcPr>
+            <w:tcW w:w="2381" w:type="dxa"/>
+            <w:tcBorders>
+              <w:top w:val="single" w:sz="4" w:space="0" w:color="000000"/>
+              <w:left w:val="single" w:sz="4" w:space="0" w:color="000000"/>
+              <w:bottom w:val="single" w:sz="4" w:space="0" w:color="000000"/>
+              <w:right w:val="single" w:sz="4" w:space="0" w:color="000000"/>
+            </w:tcBorders>
+          </w:tcPr>
+          <w:p>
+            <w:r/>
+            <w:r>
+              <w:rPr>
+                <w:b w:val="0"/>
+                <w:sz w:val="20"/>
+              </w:rPr>
+            </w:r>
+          </w:p>
+        </w:tc>
+        <w:tc>
+          <w:tcPr>
+            <w:tcW w:w="6641" w:type="dxa"/>
+            <w:tcBorders>
+              <w:top w:val="single" w:sz="4" w:space="0" w:color="000000"/>
+              <w:left w:val="single" w:sz="4" w:space="0" w:color="000000"/>
+              <w:bottom w:val="single" w:sz="4" w:space="0" w:color="000000"/>
+              <w:right w:val="single" w:sz="4" w:space="0" w:color="000000"/>
+            </w:tcBorders>
+          </w:tcPr>
+          <w:p>
+            <w:r/>
+            <w:r>
+              <w:rPr>
+                <w:b w:val="0"/>
+                <w:sz w:val="20"/>
+              </w:rPr>
+              <w:t>5. Fluxo alternativo — telefone já cadastrado em outra conta: o sistema recusa a alteração com HTTP 409 e a mensagem “Este celular já está cadastrado em outra conta.”, preservados os dados anteriores.</w:t>
+            </w:r>
+          </w:p>
+        </w:tc>
+      </w:tr>
     </w:tbl>
     <w:p>
       <w:r>
@@ -1161,7 +1204,7 @@
                 <w:b w:val="0"/>
                 <w:sz w:val="20"/>
               </w:rPr>
-              <w:t>Inativação de conta pelo administrador</w:t>
+              <w:t>Ativação da verificação em duas etapas por SMS</w:t>
             </w:r>
           </w:p>
         </w:tc>
@@ -1205,7 +1248,7 @@
                 <w:b w:val="0"/>
                 <w:sz w:val="20"/>
               </w:rPr>
-              <w:t>Administrador</w:t>
+              <w:t>Usuário autenticado (qualquer perfil); Celular gateway de SMS</w:t>
             </w:r>
           </w:p>
         </w:tc>
@@ -1249,7 +1292,7 @@
                 <w:b w:val="0"/>
                 <w:sz w:val="20"/>
               </w:rPr>
-              <w:t>A conta a ser inativada existe e está ativa.</w:t>
+              <w:t>O usuário está autenticado, a verificação por SMS está desativada na conta e o envio por SMS está habilitado no servidor.</w:t>
             </w:r>
           </w:p>
         </w:tc>
@@ -1293,7 +1336,7 @@
                 <w:b w:val="0"/>
                 <w:sz w:val="20"/>
               </w:rPr>
-              <w:t>Conta marcada como inativa; as ocorrências registradas são preservadas.</w:t>
+              <w:t>Verificação em duas etapas por SMS ativada; celular confirmado gravado no formato E.164 em campo próprio da conta, distinto do telefone do perfil, e exigido como segundo fator nas autenticações seguintes.</w:t>
             </w:r>
           </w:p>
         </w:tc>
@@ -1360,199 +1403,500 @@
                 <w:b w:val="0"/>
                 <w:sz w:val="20"/>
               </w:rPr>
-              <w:t>1. O administrador localiza a conta na gestão de usuários e aciona a inativação.</w:t>
-            </w:r>
-          </w:p>
-        </w:tc>
-        <w:tc>
-          <w:tcPr>
-            <w:tcW w:w="6641" w:type="dxa"/>
-            <w:tcBorders>
-              <w:top w:val="single" w:sz="4" w:space="0" w:color="000000"/>
-              <w:left w:val="single" w:sz="4" w:space="0" w:color="000000"/>
-              <w:bottom w:val="single" w:sz="4" w:space="0" w:color="000000"/>
-              <w:right w:val="single" w:sz="4" w:space="0" w:color="000000"/>
-            </w:tcBorders>
-          </w:tcPr>
-          <w:p>
-            <w:r/>
-            <w:r>
-              <w:rPr>
-                <w:b w:val="0"/>
-                <w:sz w:val="20"/>
-              </w:rPr>
-            </w:r>
-          </w:p>
-        </w:tc>
-      </w:tr>
-      <w:tr>
-        <w:tc>
-          <w:tcPr>
-            <w:tcW w:w="2381" w:type="dxa"/>
-            <w:tcBorders>
-              <w:top w:val="single" w:sz="4" w:space="0" w:color="000000"/>
-              <w:left w:val="single" w:sz="4" w:space="0" w:color="000000"/>
-              <w:bottom w:val="single" w:sz="4" w:space="0" w:color="000000"/>
-              <w:right w:val="single" w:sz="4" w:space="0" w:color="000000"/>
-            </w:tcBorders>
-          </w:tcPr>
-          <w:p>
-            <w:r/>
-            <w:r>
-              <w:rPr>
-                <w:b w:val="0"/>
-                <w:sz w:val="20"/>
-              </w:rPr>
-            </w:r>
-          </w:p>
-        </w:tc>
-        <w:tc>
-          <w:tcPr>
-            <w:tcW w:w="6641" w:type="dxa"/>
-            <w:tcBorders>
-              <w:top w:val="single" w:sz="4" w:space="0" w:color="000000"/>
-              <w:left w:val="single" w:sz="4" w:space="0" w:color="000000"/>
-              <w:bottom w:val="single" w:sz="4" w:space="0" w:color="000000"/>
-              <w:right w:val="single" w:sz="4" w:space="0" w:color="000000"/>
-            </w:tcBorders>
-          </w:tcPr>
-          <w:p>
-            <w:r/>
-            <w:r>
-              <w:rPr>
-                <w:b w:val="0"/>
-                <w:sz w:val="20"/>
-              </w:rPr>
-              <w:t>2. O sistema solicita a confirmação da operação.</w:t>
-            </w:r>
-          </w:p>
-        </w:tc>
-      </w:tr>
-      <w:tr>
-        <w:tc>
-          <w:tcPr>
-            <w:tcW w:w="2381" w:type="dxa"/>
-            <w:tcBorders>
-              <w:top w:val="single" w:sz="4" w:space="0" w:color="000000"/>
-              <w:left w:val="single" w:sz="4" w:space="0" w:color="000000"/>
-              <w:bottom w:val="single" w:sz="4" w:space="0" w:color="000000"/>
-              <w:right w:val="single" w:sz="4" w:space="0" w:color="000000"/>
-            </w:tcBorders>
-          </w:tcPr>
-          <w:p>
-            <w:r/>
-            <w:r>
-              <w:rPr>
-                <w:b w:val="0"/>
-                <w:sz w:val="20"/>
-              </w:rPr>
-              <w:t>3. O administrador confirma.</w:t>
-            </w:r>
-          </w:p>
-        </w:tc>
-        <w:tc>
-          <w:tcPr>
-            <w:tcW w:w="6641" w:type="dxa"/>
-            <w:tcBorders>
-              <w:top w:val="single" w:sz="4" w:space="0" w:color="000000"/>
-              <w:left w:val="single" w:sz="4" w:space="0" w:color="000000"/>
-              <w:bottom w:val="single" w:sz="4" w:space="0" w:color="000000"/>
-              <w:right w:val="single" w:sz="4" w:space="0" w:color="000000"/>
-            </w:tcBorders>
-          </w:tcPr>
-          <w:p>
-            <w:r/>
-            <w:r>
-              <w:rPr>
-                <w:b w:val="0"/>
-                <w:sz w:val="20"/>
-              </w:rPr>
-            </w:r>
-          </w:p>
-        </w:tc>
-      </w:tr>
-      <w:tr>
-        <w:tc>
-          <w:tcPr>
-            <w:tcW w:w="2381" w:type="dxa"/>
-            <w:tcBorders>
-              <w:top w:val="single" w:sz="4" w:space="0" w:color="000000"/>
-              <w:left w:val="single" w:sz="4" w:space="0" w:color="000000"/>
-              <w:bottom w:val="single" w:sz="4" w:space="0" w:color="000000"/>
-              <w:right w:val="single" w:sz="4" w:space="0" w:color="000000"/>
-            </w:tcBorders>
-          </w:tcPr>
-          <w:p>
-            <w:r/>
-            <w:r>
-              <w:rPr>
-                <w:b w:val="0"/>
-                <w:sz w:val="20"/>
-              </w:rPr>
-            </w:r>
-          </w:p>
-        </w:tc>
-        <w:tc>
-          <w:tcPr>
-            <w:tcW w:w="6641" w:type="dxa"/>
-            <w:tcBorders>
-              <w:top w:val="single" w:sz="4" w:space="0" w:color="000000"/>
-              <w:left w:val="single" w:sz="4" w:space="0" w:color="000000"/>
-              <w:bottom w:val="single" w:sz="4" w:space="0" w:color="000000"/>
-              <w:right w:val="single" w:sz="4" w:space="0" w:color="000000"/>
-            </w:tcBorders>
-          </w:tcPr>
-          <w:p>
-            <w:r/>
-            <w:r>
-              <w:rPr>
-                <w:b w:val="0"/>
-                <w:sz w:val="20"/>
-              </w:rPr>
-              <w:t>4. O sistema marca a conta como inativa, impedindo novas autenticações.</w:t>
-            </w:r>
-          </w:p>
-        </w:tc>
-      </w:tr>
-      <w:tr>
-        <w:tc>
-          <w:tcPr>
-            <w:tcW w:w="2381" w:type="dxa"/>
-            <w:tcBorders>
-              <w:top w:val="single" w:sz="4" w:space="0" w:color="000000"/>
-              <w:left w:val="single" w:sz="4" w:space="0" w:color="000000"/>
-              <w:bottom w:val="single" w:sz="4" w:space="0" w:color="000000"/>
-              <w:right w:val="single" w:sz="4" w:space="0" w:color="000000"/>
-            </w:tcBorders>
-          </w:tcPr>
-          <w:p>
-            <w:r/>
-            <w:r>
-              <w:rPr>
-                <w:b w:val="0"/>
-                <w:sz w:val="20"/>
-              </w:rPr>
-            </w:r>
-          </w:p>
-        </w:tc>
-        <w:tc>
-          <w:tcPr>
-            <w:tcW w:w="6641" w:type="dxa"/>
-            <w:tcBorders>
-              <w:top w:val="single" w:sz="4" w:space="0" w:color="000000"/>
-              <w:left w:val="single" w:sz="4" w:space="0" w:color="000000"/>
-              <w:bottom w:val="single" w:sz="4" w:space="0" w:color="000000"/>
-              <w:right w:val="single" w:sz="4" w:space="0" w:color="000000"/>
-            </w:tcBorders>
-          </w:tcPr>
-          <w:p>
-            <w:r/>
-            <w:r>
-              <w:rPr>
-                <w:b w:val="0"/>
-                <w:sz w:val="20"/>
-              </w:rPr>
-              <w:t>5. O sistema preserva as ocorrências registradas pela conta, mantendo a integridade do histórico público.</w:t>
+              <w:t>1. O usuário acessa “Meu Perfil” e aciona “Ativar” na linha “MFA por SMS”.</w:t>
+            </w:r>
+          </w:p>
+        </w:tc>
+        <w:tc>
+          <w:tcPr>
+            <w:tcW w:w="6641" w:type="dxa"/>
+            <w:tcBorders>
+              <w:top w:val="single" w:sz="4" w:space="0" w:color="000000"/>
+              <w:left w:val="single" w:sz="4" w:space="0" w:color="000000"/>
+              <w:bottom w:val="single" w:sz="4" w:space="0" w:color="000000"/>
+              <w:right w:val="single" w:sz="4" w:space="0" w:color="000000"/>
+            </w:tcBorders>
+          </w:tcPr>
+          <w:p>
+            <w:r/>
+            <w:r>
+              <w:rPr>
+                <w:b w:val="0"/>
+                <w:sz w:val="20"/>
+              </w:rPr>
+            </w:r>
+          </w:p>
+        </w:tc>
+      </w:tr>
+      <w:tr>
+        <w:tc>
+          <w:tcPr>
+            <w:tcW w:w="2381" w:type="dxa"/>
+            <w:tcBorders>
+              <w:top w:val="single" w:sz="4" w:space="0" w:color="000000"/>
+              <w:left w:val="single" w:sz="4" w:space="0" w:color="000000"/>
+              <w:bottom w:val="single" w:sz="4" w:space="0" w:color="000000"/>
+              <w:right w:val="single" w:sz="4" w:space="0" w:color="000000"/>
+            </w:tcBorders>
+          </w:tcPr>
+          <w:p>
+            <w:r/>
+            <w:r>
+              <w:rPr>
+                <w:b w:val="0"/>
+                <w:sz w:val="20"/>
+              </w:rPr>
+            </w:r>
+          </w:p>
+        </w:tc>
+        <w:tc>
+          <w:tcPr>
+            <w:tcW w:w="6641" w:type="dxa"/>
+            <w:tcBorders>
+              <w:top w:val="single" w:sz="4" w:space="0" w:color="000000"/>
+              <w:left w:val="single" w:sz="4" w:space="0" w:color="000000"/>
+              <w:bottom w:val="single" w:sz="4" w:space="0" w:color="000000"/>
+              <w:right w:val="single" w:sz="4" w:space="0" w:color="000000"/>
+            </w:tcBorders>
+          </w:tcPr>
+          <w:p>
+            <w:r/>
+            <w:r>
+              <w:rPr>
+                <w:b w:val="0"/>
+                <w:sz w:val="20"/>
+              </w:rPr>
+              <w:t>2. O sistema solicita a confirmação do número de celular, preenchido previamente com o telefone do perfil.</w:t>
+            </w:r>
+          </w:p>
+        </w:tc>
+      </w:tr>
+      <w:tr>
+        <w:tc>
+          <w:tcPr>
+            <w:tcW w:w="2381" w:type="dxa"/>
+            <w:tcBorders>
+              <w:top w:val="single" w:sz="4" w:space="0" w:color="000000"/>
+              <w:left w:val="single" w:sz="4" w:space="0" w:color="000000"/>
+              <w:bottom w:val="single" w:sz="4" w:space="0" w:color="000000"/>
+              <w:right w:val="single" w:sz="4" w:space="0" w:color="000000"/>
+            </w:tcBorders>
+          </w:tcPr>
+          <w:p>
+            <w:r/>
+            <w:r>
+              <w:rPr>
+                <w:b w:val="0"/>
+                <w:sz w:val="20"/>
+              </w:rPr>
+              <w:t>3. O usuário confirma ou corrige o número e solicita o envio do código.</w:t>
+            </w:r>
+          </w:p>
+        </w:tc>
+        <w:tc>
+          <w:tcPr>
+            <w:tcW w:w="6641" w:type="dxa"/>
+            <w:tcBorders>
+              <w:top w:val="single" w:sz="4" w:space="0" w:color="000000"/>
+              <w:left w:val="single" w:sz="4" w:space="0" w:color="000000"/>
+              <w:bottom w:val="single" w:sz="4" w:space="0" w:color="000000"/>
+              <w:right w:val="single" w:sz="4" w:space="0" w:color="000000"/>
+            </w:tcBorders>
+          </w:tcPr>
+          <w:p>
+            <w:r/>
+            <w:r>
+              <w:rPr>
+                <w:b w:val="0"/>
+                <w:sz w:val="20"/>
+              </w:rPr>
+            </w:r>
+          </w:p>
+        </w:tc>
+      </w:tr>
+      <w:tr>
+        <w:tc>
+          <w:tcPr>
+            <w:tcW w:w="2381" w:type="dxa"/>
+            <w:tcBorders>
+              <w:top w:val="single" w:sz="4" w:space="0" w:color="000000"/>
+              <w:left w:val="single" w:sz="4" w:space="0" w:color="000000"/>
+              <w:bottom w:val="single" w:sz="4" w:space="0" w:color="000000"/>
+              <w:right w:val="single" w:sz="4" w:space="0" w:color="000000"/>
+            </w:tcBorders>
+          </w:tcPr>
+          <w:p>
+            <w:r/>
+            <w:r>
+              <w:rPr>
+                <w:b w:val="0"/>
+                <w:sz w:val="20"/>
+              </w:rPr>
+            </w:r>
+          </w:p>
+        </w:tc>
+        <w:tc>
+          <w:tcPr>
+            <w:tcW w:w="6641" w:type="dxa"/>
+            <w:tcBorders>
+              <w:top w:val="single" w:sz="4" w:space="0" w:color="000000"/>
+              <w:left w:val="single" w:sz="4" w:space="0" w:color="000000"/>
+              <w:bottom w:val="single" w:sz="4" w:space="0" w:color="000000"/>
+              <w:right w:val="single" w:sz="4" w:space="0" w:color="000000"/>
+            </w:tcBorders>
+          </w:tcPr>
+          <w:p>
+            <w:r/>
+            <w:r>
+              <w:rPr>
+                <w:b w:val="0"/>
+                <w:sz w:val="20"/>
+              </w:rPr>
+              <w:t>4. O sistema normaliza o número para o formato E.164, verifica tratar-se de celular brasileiro (DDD, dígito 9 e oito dígitos) não vinculado a outra conta e remete, por meio do celular gateway de SMS, o código de seis dígitos, válido por dez minutos e vinculado ao número de destino.</w:t>
+            </w:r>
+          </w:p>
+        </w:tc>
+      </w:tr>
+      <w:tr>
+        <w:tc>
+          <w:tcPr>
+            <w:tcW w:w="2381" w:type="dxa"/>
+            <w:tcBorders>
+              <w:top w:val="single" w:sz="4" w:space="0" w:color="000000"/>
+              <w:left w:val="single" w:sz="4" w:space="0" w:color="000000"/>
+              <w:bottom w:val="single" w:sz="4" w:space="0" w:color="000000"/>
+              <w:right w:val="single" w:sz="4" w:space="0" w:color="000000"/>
+            </w:tcBorders>
+          </w:tcPr>
+          <w:p>
+            <w:r/>
+            <w:r>
+              <w:rPr>
+                <w:b w:val="0"/>
+                <w:sz w:val="20"/>
+              </w:rPr>
+            </w:r>
+          </w:p>
+        </w:tc>
+        <w:tc>
+          <w:tcPr>
+            <w:tcW w:w="6641" w:type="dxa"/>
+            <w:tcBorders>
+              <w:top w:val="single" w:sz="4" w:space="0" w:color="000000"/>
+              <w:left w:val="single" w:sz="4" w:space="0" w:color="000000"/>
+              <w:bottom w:val="single" w:sz="4" w:space="0" w:color="000000"/>
+              <w:right w:val="single" w:sz="4" w:space="0" w:color="000000"/>
+            </w:tcBorders>
+          </w:tcPr>
+          <w:p>
+            <w:r/>
+            <w:r>
+              <w:rPr>
+                <w:b w:val="0"/>
+                <w:sz w:val="20"/>
+              </w:rPr>
+              <w:t>5. O sistema apresenta o campo do código e o botão “Reenviar código”, liberado após contagem regressiva de 60 segundos.</w:t>
+            </w:r>
+          </w:p>
+        </w:tc>
+      </w:tr>
+      <w:tr>
+        <w:tc>
+          <w:tcPr>
+            <w:tcW w:w="2381" w:type="dxa"/>
+            <w:tcBorders>
+              <w:top w:val="single" w:sz="4" w:space="0" w:color="000000"/>
+              <w:left w:val="single" w:sz="4" w:space="0" w:color="000000"/>
+              <w:bottom w:val="single" w:sz="4" w:space="0" w:color="000000"/>
+              <w:right w:val="single" w:sz="4" w:space="0" w:color="000000"/>
+            </w:tcBorders>
+          </w:tcPr>
+          <w:p>
+            <w:r/>
+            <w:r>
+              <w:rPr>
+                <w:b w:val="0"/>
+                <w:sz w:val="20"/>
+              </w:rPr>
+              <w:t>6. O usuário informa o código recebido.</w:t>
+            </w:r>
+          </w:p>
+        </w:tc>
+        <w:tc>
+          <w:tcPr>
+            <w:tcW w:w="6641" w:type="dxa"/>
+            <w:tcBorders>
+              <w:top w:val="single" w:sz="4" w:space="0" w:color="000000"/>
+              <w:left w:val="single" w:sz="4" w:space="0" w:color="000000"/>
+              <w:bottom w:val="single" w:sz="4" w:space="0" w:color="000000"/>
+              <w:right w:val="single" w:sz="4" w:space="0" w:color="000000"/>
+            </w:tcBorders>
+          </w:tcPr>
+          <w:p>
+            <w:r/>
+            <w:r>
+              <w:rPr>
+                <w:b w:val="0"/>
+                <w:sz w:val="20"/>
+              </w:rPr>
+            </w:r>
+          </w:p>
+        </w:tc>
+      </w:tr>
+      <w:tr>
+        <w:tc>
+          <w:tcPr>
+            <w:tcW w:w="2381" w:type="dxa"/>
+            <w:tcBorders>
+              <w:top w:val="single" w:sz="4" w:space="0" w:color="000000"/>
+              <w:left w:val="single" w:sz="4" w:space="0" w:color="000000"/>
+              <w:bottom w:val="single" w:sz="4" w:space="0" w:color="000000"/>
+              <w:right w:val="single" w:sz="4" w:space="0" w:color="000000"/>
+            </w:tcBorders>
+          </w:tcPr>
+          <w:p>
+            <w:r/>
+            <w:r>
+              <w:rPr>
+                <w:b w:val="0"/>
+                <w:sz w:val="20"/>
+              </w:rPr>
+            </w:r>
+          </w:p>
+        </w:tc>
+        <w:tc>
+          <w:tcPr>
+            <w:tcW w:w="6641" w:type="dxa"/>
+            <w:tcBorders>
+              <w:top w:val="single" w:sz="4" w:space="0" w:color="000000"/>
+              <w:left w:val="single" w:sz="4" w:space="0" w:color="000000"/>
+              <w:bottom w:val="single" w:sz="4" w:space="0" w:color="000000"/>
+              <w:right w:val="single" w:sz="4" w:space="0" w:color="000000"/>
+            </w:tcBorders>
+          </w:tcPr>
+          <w:p>
+            <w:r/>
+            <w:r>
+              <w:rPr>
+                <w:b w:val="0"/>
+                <w:sz w:val="20"/>
+              </w:rPr>
+              <w:t>7. O sistema valida o código para o canal SMS e para o número confirmado, grava o celular na conta e passa a apresentar o método como ativo, com o número mascarado no formato “(35) 9****-1234”.</w:t>
+            </w:r>
+          </w:p>
+        </w:tc>
+      </w:tr>
+      <w:tr>
+        <w:tc>
+          <w:tcPr>
+            <w:tcW w:w="2381" w:type="dxa"/>
+            <w:tcBorders>
+              <w:top w:val="single" w:sz="4" w:space="0" w:color="000000"/>
+              <w:left w:val="single" w:sz="4" w:space="0" w:color="000000"/>
+              <w:bottom w:val="single" w:sz="4" w:space="0" w:color="000000"/>
+              <w:right w:val="single" w:sz="4" w:space="0" w:color="000000"/>
+            </w:tcBorders>
+          </w:tcPr>
+          <w:p>
+            <w:r/>
+            <w:r>
+              <w:rPr>
+                <w:b w:val="0"/>
+                <w:sz w:val="20"/>
+              </w:rPr>
+            </w:r>
+          </w:p>
+        </w:tc>
+        <w:tc>
+          <w:tcPr>
+            <w:tcW w:w="6641" w:type="dxa"/>
+            <w:tcBorders>
+              <w:top w:val="single" w:sz="4" w:space="0" w:color="000000"/>
+              <w:left w:val="single" w:sz="4" w:space="0" w:color="000000"/>
+              <w:bottom w:val="single" w:sz="4" w:space="0" w:color="000000"/>
+              <w:right w:val="single" w:sz="4" w:space="0" w:color="000000"/>
+            </w:tcBorders>
+          </w:tcPr>
+          <w:p>
+            <w:r/>
+            <w:r>
+              <w:rPr>
+                <w:b w:val="0"/>
+                <w:sz w:val="20"/>
+              </w:rPr>
+              <w:t>8. Fluxo alternativo — celular inválido ou telefone fixo: o sistema recusa o envio com HTTP 400, sem acionar o gateway, e apresenta a mensagem “Celular inválido. Informe DDD e número de celular (com o 9).”.</w:t>
+            </w:r>
+          </w:p>
+        </w:tc>
+      </w:tr>
+      <w:tr>
+        <w:tc>
+          <w:tcPr>
+            <w:tcW w:w="2381" w:type="dxa"/>
+            <w:tcBorders>
+              <w:top w:val="single" w:sz="4" w:space="0" w:color="000000"/>
+              <w:left w:val="single" w:sz="4" w:space="0" w:color="000000"/>
+              <w:bottom w:val="single" w:sz="4" w:space="0" w:color="000000"/>
+              <w:right w:val="single" w:sz="4" w:space="0" w:color="000000"/>
+            </w:tcBorders>
+          </w:tcPr>
+          <w:p>
+            <w:r/>
+            <w:r>
+              <w:rPr>
+                <w:b w:val="0"/>
+                <w:sz w:val="20"/>
+              </w:rPr>
+            </w:r>
+          </w:p>
+        </w:tc>
+        <w:tc>
+          <w:tcPr>
+            <w:tcW w:w="6641" w:type="dxa"/>
+            <w:tcBorders>
+              <w:top w:val="single" w:sz="4" w:space="0" w:color="000000"/>
+              <w:left w:val="single" w:sz="4" w:space="0" w:color="000000"/>
+              <w:bottom w:val="single" w:sz="4" w:space="0" w:color="000000"/>
+              <w:right w:val="single" w:sz="4" w:space="0" w:color="000000"/>
+            </w:tcBorders>
+          </w:tcPr>
+          <w:p>
+            <w:r/>
+            <w:r>
+              <w:rPr>
+                <w:b w:val="0"/>
+                <w:sz w:val="20"/>
+              </w:rPr>
+              <w:t>9. Fluxo alternativo — celular vinculado a outra conta: o sistema recusa a operação com HTTP 409 e a mensagem “Este celular já está cadastrado em outra conta.”.</w:t>
+            </w:r>
+          </w:p>
+        </w:tc>
+      </w:tr>
+      <w:tr>
+        <w:tc>
+          <w:tcPr>
+            <w:tcW w:w="2381" w:type="dxa"/>
+            <w:tcBorders>
+              <w:top w:val="single" w:sz="4" w:space="0" w:color="000000"/>
+              <w:left w:val="single" w:sz="4" w:space="0" w:color="000000"/>
+              <w:bottom w:val="single" w:sz="4" w:space="0" w:color="000000"/>
+              <w:right w:val="single" w:sz="4" w:space="0" w:color="000000"/>
+            </w:tcBorders>
+          </w:tcPr>
+          <w:p>
+            <w:r/>
+            <w:r>
+              <w:rPr>
+                <w:b w:val="0"/>
+                <w:sz w:val="20"/>
+              </w:rPr>
+            </w:r>
+          </w:p>
+        </w:tc>
+        <w:tc>
+          <w:tcPr>
+            <w:tcW w:w="6641" w:type="dxa"/>
+            <w:tcBorders>
+              <w:top w:val="single" w:sz="4" w:space="0" w:color="000000"/>
+              <w:left w:val="single" w:sz="4" w:space="0" w:color="000000"/>
+              <w:bottom w:val="single" w:sz="4" w:space="0" w:color="000000"/>
+              <w:right w:val="single" w:sz="4" w:space="0" w:color="000000"/>
+            </w:tcBorders>
+          </w:tcPr>
+          <w:p>
+            <w:r/>
+            <w:r>
+              <w:rPr>
+                <w:b w:val="0"/>
+                <w:sz w:val="20"/>
+              </w:rPr>
+              <w:t>10. Fluxo alternativo — novo envio antes de 60 segundos: o sistema recusa o reenvio com HTTP 429, mantém válido o código anterior e informa “Aguarde um minuto para pedir outro código.”.</w:t>
+            </w:r>
+          </w:p>
+        </w:tc>
+      </w:tr>
+      <w:tr>
+        <w:tc>
+          <w:tcPr>
+            <w:tcW w:w="2381" w:type="dxa"/>
+            <w:tcBorders>
+              <w:top w:val="single" w:sz="4" w:space="0" w:color="000000"/>
+              <w:left w:val="single" w:sz="4" w:space="0" w:color="000000"/>
+              <w:bottom w:val="single" w:sz="4" w:space="0" w:color="000000"/>
+              <w:right w:val="single" w:sz="4" w:space="0" w:color="000000"/>
+            </w:tcBorders>
+          </w:tcPr>
+          <w:p>
+            <w:r/>
+            <w:r>
+              <w:rPr>
+                <w:b w:val="0"/>
+                <w:sz w:val="20"/>
+              </w:rPr>
+            </w:r>
+          </w:p>
+        </w:tc>
+        <w:tc>
+          <w:tcPr>
+            <w:tcW w:w="6641" w:type="dxa"/>
+            <w:tcBorders>
+              <w:top w:val="single" w:sz="4" w:space="0" w:color="000000"/>
+              <w:left w:val="single" w:sz="4" w:space="0" w:color="000000"/>
+              <w:bottom w:val="single" w:sz="4" w:space="0" w:color="000000"/>
+              <w:right w:val="single" w:sz="4" w:space="0" w:color="000000"/>
+            </w:tcBorders>
+          </w:tcPr>
+          <w:p>
+            <w:r/>
+            <w:r>
+              <w:rPr>
+                <w:b w:val="0"/>
+                <w:sz w:val="20"/>
+              </w:rPr>
+              <w:t>11. Fluxo alternativo — código incorreto ou expirado: o sistema recusa a ativação com HTTP 401, informa “Código inválido ou expirado.” e mantém o SMS desativado.</w:t>
+            </w:r>
+          </w:p>
+        </w:tc>
+      </w:tr>
+      <w:tr>
+        <w:tc>
+          <w:tcPr>
+            <w:tcW w:w="2381" w:type="dxa"/>
+            <w:tcBorders>
+              <w:top w:val="single" w:sz="4" w:space="0" w:color="000000"/>
+              <w:left w:val="single" w:sz="4" w:space="0" w:color="000000"/>
+              <w:bottom w:val="single" w:sz="4" w:space="0" w:color="000000"/>
+              <w:right w:val="single" w:sz="4" w:space="0" w:color="000000"/>
+            </w:tcBorders>
+          </w:tcPr>
+          <w:p>
+            <w:r/>
+            <w:r>
+              <w:rPr>
+                <w:b w:val="0"/>
+                <w:sz w:val="20"/>
+              </w:rPr>
+            </w:r>
+          </w:p>
+        </w:tc>
+        <w:tc>
+          <w:tcPr>
+            <w:tcW w:w="6641" w:type="dxa"/>
+            <w:tcBorders>
+              <w:top w:val="single" w:sz="4" w:space="0" w:color="000000"/>
+              <w:left w:val="single" w:sz="4" w:space="0" w:color="000000"/>
+              <w:bottom w:val="single" w:sz="4" w:space="0" w:color="000000"/>
+              <w:right w:val="single" w:sz="4" w:space="0" w:color="000000"/>
+            </w:tcBorders>
+          </w:tcPr>
+          <w:p>
+            <w:r/>
+            <w:r>
+              <w:rPr>
+                <w:b w:val="0"/>
+                <w:sz w:val="20"/>
+              </w:rPr>
+              <w:t>12. Fluxo alternativo — falha do celular gateway de SMS: o sistema responde com HTTP 502 e informa que não foi possível enviar o SMS, permitindo nova tentativa.</w:t>
             </w:r>
           </w:p>
         </w:tc>
@@ -1563,7 +1907,7 @@
         <w:rPr>
           <w:sz w:val="18"/>
         </w:rPr>
-        <w:t>QUADRO 3 – Fluxo de eventos do cenário “Inativação de conta pelo administrador”</w:t>
+        <w:t>QUADRO 3 – Fluxo de eventos do cenário “Ativação da verificação em duas etapas por SMS”</w:t>
       </w:r>
     </w:p>
     <w:p/>
@@ -1626,7 +1970,7 @@
                 <w:b w:val="0"/>
                 <w:sz w:val="20"/>
               </w:rPr>
-              <w:t>Relacionar usuário à instituição</w:t>
+              <w:t>Gerenciar conta de usuário</w:t>
             </w:r>
           </w:p>
         </w:tc>
@@ -1670,7 +2014,7 @@
                 <w:b w:val="0"/>
                 <w:sz w:val="20"/>
               </w:rPr>
-              <w:t>Vinculação do funcionário ao departamento responsável</w:t>
+              <w:t>Inativação de conta pelo administrador</w:t>
             </w:r>
           </w:p>
         </w:tc>
@@ -1758,7 +2102,7 @@
                 <w:b w:val="0"/>
                 <w:sz w:val="20"/>
               </w:rPr>
-              <w:t>Existem departamentos cadastrados e conta com o perfil EMPLOYEE.</w:t>
+              <w:t>A conta a ser inativada existe e está ativa.</w:t>
             </w:r>
           </w:p>
         </w:tc>
@@ -1802,7 +2146,7 @@
                 <w:b w:val="0"/>
                 <w:sz w:val="20"/>
               </w:rPr>
-              <w:t>Funcionário vinculado ao departamento, que passa a receber as ocorrências das categorias correspondentes.</w:t>
+              <w:t>Conta marcada como inativa e sessão aberta encerrada; as ocorrências registradas são preservadas.</w:t>
             </w:r>
           </w:p>
         </w:tc>
@@ -1869,156 +2213,242 @@
                 <w:b w:val="0"/>
                 <w:sz w:val="20"/>
               </w:rPr>
-              <w:t>1. O administrador seleciona a conta do funcionário na gestão de usuários.</w:t>
-            </w:r>
-          </w:p>
-        </w:tc>
-        <w:tc>
-          <w:tcPr>
-            <w:tcW w:w="6641" w:type="dxa"/>
-            <w:tcBorders>
-              <w:top w:val="single" w:sz="4" w:space="0" w:color="000000"/>
-              <w:left w:val="single" w:sz="4" w:space="0" w:color="000000"/>
-              <w:bottom w:val="single" w:sz="4" w:space="0" w:color="000000"/>
-              <w:right w:val="single" w:sz="4" w:space="0" w:color="000000"/>
-            </w:tcBorders>
-          </w:tcPr>
-          <w:p>
-            <w:r/>
-            <w:r>
-              <w:rPr>
-                <w:b w:val="0"/>
-                <w:sz w:val="20"/>
-              </w:rPr>
-            </w:r>
-          </w:p>
-        </w:tc>
-      </w:tr>
-      <w:tr>
-        <w:tc>
-          <w:tcPr>
-            <w:tcW w:w="2381" w:type="dxa"/>
-            <w:tcBorders>
-              <w:top w:val="single" w:sz="4" w:space="0" w:color="000000"/>
-              <w:left w:val="single" w:sz="4" w:space="0" w:color="000000"/>
-              <w:bottom w:val="single" w:sz="4" w:space="0" w:color="000000"/>
-              <w:right w:val="single" w:sz="4" w:space="0" w:color="000000"/>
-            </w:tcBorders>
-          </w:tcPr>
-          <w:p>
-            <w:r/>
-            <w:r>
-              <w:rPr>
-                <w:b w:val="0"/>
-                <w:sz w:val="20"/>
-              </w:rPr>
-              <w:t>2. O administrador escolhe o departamento de lotação.</w:t>
-            </w:r>
-          </w:p>
-        </w:tc>
-        <w:tc>
-          <w:tcPr>
-            <w:tcW w:w="6641" w:type="dxa"/>
-            <w:tcBorders>
-              <w:top w:val="single" w:sz="4" w:space="0" w:color="000000"/>
-              <w:left w:val="single" w:sz="4" w:space="0" w:color="000000"/>
-              <w:bottom w:val="single" w:sz="4" w:space="0" w:color="000000"/>
-              <w:right w:val="single" w:sz="4" w:space="0" w:color="000000"/>
-            </w:tcBorders>
-          </w:tcPr>
-          <w:p>
-            <w:r/>
-            <w:r>
-              <w:rPr>
-                <w:b w:val="0"/>
-                <w:sz w:val="20"/>
-              </w:rPr>
-            </w:r>
-          </w:p>
-        </w:tc>
-      </w:tr>
-      <w:tr>
-        <w:tc>
-          <w:tcPr>
-            <w:tcW w:w="2381" w:type="dxa"/>
-            <w:tcBorders>
-              <w:top w:val="single" w:sz="4" w:space="0" w:color="000000"/>
-              <w:left w:val="single" w:sz="4" w:space="0" w:color="000000"/>
-              <w:bottom w:val="single" w:sz="4" w:space="0" w:color="000000"/>
-              <w:right w:val="single" w:sz="4" w:space="0" w:color="000000"/>
-            </w:tcBorders>
-          </w:tcPr>
-          <w:p>
-            <w:r/>
-            <w:r>
-              <w:rPr>
-                <w:b w:val="0"/>
-                <w:sz w:val="20"/>
-              </w:rPr>
-            </w:r>
-          </w:p>
-        </w:tc>
-        <w:tc>
-          <w:tcPr>
-            <w:tcW w:w="6641" w:type="dxa"/>
-            <w:tcBorders>
-              <w:top w:val="single" w:sz="4" w:space="0" w:color="000000"/>
-              <w:left w:val="single" w:sz="4" w:space="0" w:color="000000"/>
-              <w:bottom w:val="single" w:sz="4" w:space="0" w:color="000000"/>
-              <w:right w:val="single" w:sz="4" w:space="0" w:color="000000"/>
-            </w:tcBorders>
-          </w:tcPr>
-          <w:p>
-            <w:r/>
-            <w:r>
-              <w:rPr>
-                <w:b w:val="0"/>
-                <w:sz w:val="20"/>
-              </w:rPr>
-              <w:t>3. O sistema grava o vínculo entre a conta e o departamento.</w:t>
-            </w:r>
-          </w:p>
-        </w:tc>
-      </w:tr>
-      <w:tr>
-        <w:tc>
-          <w:tcPr>
-            <w:tcW w:w="2381" w:type="dxa"/>
-            <w:tcBorders>
-              <w:top w:val="single" w:sz="4" w:space="0" w:color="000000"/>
-              <w:left w:val="single" w:sz="4" w:space="0" w:color="000000"/>
-              <w:bottom w:val="single" w:sz="4" w:space="0" w:color="000000"/>
-              <w:right w:val="single" w:sz="4" w:space="0" w:color="000000"/>
-            </w:tcBorders>
-          </w:tcPr>
-          <w:p>
-            <w:r/>
-            <w:r>
-              <w:rPr>
-                <w:b w:val="0"/>
-                <w:sz w:val="20"/>
-              </w:rPr>
-            </w:r>
-          </w:p>
-        </w:tc>
-        <w:tc>
-          <w:tcPr>
-            <w:tcW w:w="6641" w:type="dxa"/>
-            <w:tcBorders>
-              <w:top w:val="single" w:sz="4" w:space="0" w:color="000000"/>
-              <w:left w:val="single" w:sz="4" w:space="0" w:color="000000"/>
-              <w:bottom w:val="single" w:sz="4" w:space="0" w:color="000000"/>
-              <w:right w:val="single" w:sz="4" w:space="0" w:color="000000"/>
-            </w:tcBorders>
-          </w:tcPr>
-          <w:p>
-            <w:r/>
-            <w:r>
-              <w:rPr>
-                <w:b w:val="0"/>
-                <w:sz w:val="20"/>
-              </w:rPr>
-              <w:t>4. O sistema passa a apresentar ao funcionário, de forma destacada, as ocorrências das categorias atribuídas ao seu departamento.</w:t>
+              <w:t>1. O administrador localiza a conta na gestão de usuários e aciona a inativação.</w:t>
+            </w:r>
+          </w:p>
+        </w:tc>
+        <w:tc>
+          <w:tcPr>
+            <w:tcW w:w="6641" w:type="dxa"/>
+            <w:tcBorders>
+              <w:top w:val="single" w:sz="4" w:space="0" w:color="000000"/>
+              <w:left w:val="single" w:sz="4" w:space="0" w:color="000000"/>
+              <w:bottom w:val="single" w:sz="4" w:space="0" w:color="000000"/>
+              <w:right w:val="single" w:sz="4" w:space="0" w:color="000000"/>
+            </w:tcBorders>
+          </w:tcPr>
+          <w:p>
+            <w:r/>
+            <w:r>
+              <w:rPr>
+                <w:b w:val="0"/>
+                <w:sz w:val="20"/>
+              </w:rPr>
+            </w:r>
+          </w:p>
+        </w:tc>
+      </w:tr>
+      <w:tr>
+        <w:tc>
+          <w:tcPr>
+            <w:tcW w:w="2381" w:type="dxa"/>
+            <w:tcBorders>
+              <w:top w:val="single" w:sz="4" w:space="0" w:color="000000"/>
+              <w:left w:val="single" w:sz="4" w:space="0" w:color="000000"/>
+              <w:bottom w:val="single" w:sz="4" w:space="0" w:color="000000"/>
+              <w:right w:val="single" w:sz="4" w:space="0" w:color="000000"/>
+            </w:tcBorders>
+          </w:tcPr>
+          <w:p>
+            <w:r/>
+            <w:r>
+              <w:rPr>
+                <w:b w:val="0"/>
+                <w:sz w:val="20"/>
+              </w:rPr>
+            </w:r>
+          </w:p>
+        </w:tc>
+        <w:tc>
+          <w:tcPr>
+            <w:tcW w:w="6641" w:type="dxa"/>
+            <w:tcBorders>
+              <w:top w:val="single" w:sz="4" w:space="0" w:color="000000"/>
+              <w:left w:val="single" w:sz="4" w:space="0" w:color="000000"/>
+              <w:bottom w:val="single" w:sz="4" w:space="0" w:color="000000"/>
+              <w:right w:val="single" w:sz="4" w:space="0" w:color="000000"/>
+            </w:tcBorders>
+          </w:tcPr>
+          <w:p>
+            <w:r/>
+            <w:r>
+              <w:rPr>
+                <w:b w:val="0"/>
+                <w:sz w:val="20"/>
+              </w:rPr>
+              <w:t>2. O sistema solicita a confirmação da operação.</w:t>
+            </w:r>
+          </w:p>
+        </w:tc>
+      </w:tr>
+      <w:tr>
+        <w:tc>
+          <w:tcPr>
+            <w:tcW w:w="2381" w:type="dxa"/>
+            <w:tcBorders>
+              <w:top w:val="single" w:sz="4" w:space="0" w:color="000000"/>
+              <w:left w:val="single" w:sz="4" w:space="0" w:color="000000"/>
+              <w:bottom w:val="single" w:sz="4" w:space="0" w:color="000000"/>
+              <w:right w:val="single" w:sz="4" w:space="0" w:color="000000"/>
+            </w:tcBorders>
+          </w:tcPr>
+          <w:p>
+            <w:r/>
+            <w:r>
+              <w:rPr>
+                <w:b w:val="0"/>
+                <w:sz w:val="20"/>
+              </w:rPr>
+              <w:t>3. O administrador confirma.</w:t>
+            </w:r>
+          </w:p>
+        </w:tc>
+        <w:tc>
+          <w:tcPr>
+            <w:tcW w:w="6641" w:type="dxa"/>
+            <w:tcBorders>
+              <w:top w:val="single" w:sz="4" w:space="0" w:color="000000"/>
+              <w:left w:val="single" w:sz="4" w:space="0" w:color="000000"/>
+              <w:bottom w:val="single" w:sz="4" w:space="0" w:color="000000"/>
+              <w:right w:val="single" w:sz="4" w:space="0" w:color="000000"/>
+            </w:tcBorders>
+          </w:tcPr>
+          <w:p>
+            <w:r/>
+            <w:r>
+              <w:rPr>
+                <w:b w:val="0"/>
+                <w:sz w:val="20"/>
+              </w:rPr>
+            </w:r>
+          </w:p>
+        </w:tc>
+      </w:tr>
+      <w:tr>
+        <w:tc>
+          <w:tcPr>
+            <w:tcW w:w="2381" w:type="dxa"/>
+            <w:tcBorders>
+              <w:top w:val="single" w:sz="4" w:space="0" w:color="000000"/>
+              <w:left w:val="single" w:sz="4" w:space="0" w:color="000000"/>
+              <w:bottom w:val="single" w:sz="4" w:space="0" w:color="000000"/>
+              <w:right w:val="single" w:sz="4" w:space="0" w:color="000000"/>
+            </w:tcBorders>
+          </w:tcPr>
+          <w:p>
+            <w:r/>
+            <w:r>
+              <w:rPr>
+                <w:b w:val="0"/>
+                <w:sz w:val="20"/>
+              </w:rPr>
+            </w:r>
+          </w:p>
+        </w:tc>
+        <w:tc>
+          <w:tcPr>
+            <w:tcW w:w="6641" w:type="dxa"/>
+            <w:tcBorders>
+              <w:top w:val="single" w:sz="4" w:space="0" w:color="000000"/>
+              <w:left w:val="single" w:sz="4" w:space="0" w:color="000000"/>
+              <w:bottom w:val="single" w:sz="4" w:space="0" w:color="000000"/>
+              <w:right w:val="single" w:sz="4" w:space="0" w:color="000000"/>
+            </w:tcBorders>
+          </w:tcPr>
+          <w:p>
+            <w:r/>
+            <w:r>
+              <w:rPr>
+                <w:b w:val="0"/>
+                <w:sz w:val="20"/>
+              </w:rPr>
+              <w:t>4. O sistema marca a conta como inativa, impedindo novas autenticações.</w:t>
+            </w:r>
+          </w:p>
+        </w:tc>
+      </w:tr>
+      <w:tr>
+        <w:tc>
+          <w:tcPr>
+            <w:tcW w:w="2381" w:type="dxa"/>
+            <w:tcBorders>
+              <w:top w:val="single" w:sz="4" w:space="0" w:color="000000"/>
+              <w:left w:val="single" w:sz="4" w:space="0" w:color="000000"/>
+              <w:bottom w:val="single" w:sz="4" w:space="0" w:color="000000"/>
+              <w:right w:val="single" w:sz="4" w:space="0" w:color="000000"/>
+            </w:tcBorders>
+          </w:tcPr>
+          <w:p>
+            <w:r/>
+            <w:r>
+              <w:rPr>
+                <w:b w:val="0"/>
+                <w:sz w:val="20"/>
+              </w:rPr>
+            </w:r>
+          </w:p>
+        </w:tc>
+        <w:tc>
+          <w:tcPr>
+            <w:tcW w:w="6641" w:type="dxa"/>
+            <w:tcBorders>
+              <w:top w:val="single" w:sz="4" w:space="0" w:color="000000"/>
+              <w:left w:val="single" w:sz="4" w:space="0" w:color="000000"/>
+              <w:bottom w:val="single" w:sz="4" w:space="0" w:color="000000"/>
+              <w:right w:val="single" w:sz="4" w:space="0" w:color="000000"/>
+            </w:tcBorders>
+          </w:tcPr>
+          <w:p>
+            <w:r/>
+            <w:r>
+              <w:rPr>
+                <w:b w:val="0"/>
+                <w:sz w:val="20"/>
+              </w:rPr>
+              <w:t>5. O sistema preserva as ocorrências registradas pela conta, mantendo a integridade do histórico público.</w:t>
+            </w:r>
+          </w:p>
+        </w:tc>
+      </w:tr>
+      <w:tr>
+        <w:tc>
+          <w:tcPr>
+            <w:tcW w:w="2381" w:type="dxa"/>
+            <w:tcBorders>
+              <w:top w:val="single" w:sz="4" w:space="0" w:color="000000"/>
+              <w:left w:val="single" w:sz="4" w:space="0" w:color="000000"/>
+              <w:bottom w:val="single" w:sz="4" w:space="0" w:color="000000"/>
+              <w:right w:val="single" w:sz="4" w:space="0" w:color="000000"/>
+            </w:tcBorders>
+          </w:tcPr>
+          <w:p>
+            <w:r/>
+            <w:r>
+              <w:rPr>
+                <w:b w:val="0"/>
+                <w:sz w:val="20"/>
+              </w:rPr>
+            </w:r>
+          </w:p>
+        </w:tc>
+        <w:tc>
+          <w:tcPr>
+            <w:tcW w:w="6641" w:type="dxa"/>
+            <w:tcBorders>
+              <w:top w:val="single" w:sz="4" w:space="0" w:color="000000"/>
+              <w:left w:val="single" w:sz="4" w:space="0" w:color="000000"/>
+              <w:bottom w:val="single" w:sz="4" w:space="0" w:color="000000"/>
+              <w:right w:val="single" w:sz="4" w:space="0" w:color="000000"/>
+            </w:tcBorders>
+          </w:tcPr>
+          <w:p>
+            <w:r/>
+            <w:r>
+              <w:rPr>
+                <w:b w:val="0"/>
+                <w:sz w:val="20"/>
+              </w:rPr>
+              <w:t>6. Caso a pessoa esteja autenticada no momento da inativação, o sistema encerra a sessão aberta da conta: na chamada seguinte ao servidor, em até 30 segundos pela verificação periódica da sessão, a pessoa recebe o aviso “Sessão encerrada — Esta conta foi excluída ou desativada pela administração e a sessão foi desconectada.” e é desconectada.</w:t>
             </w:r>
           </w:p>
         </w:tc>
@@ -2029,464 +2459,7 @@
         <w:rPr>
           <w:sz w:val="18"/>
         </w:rPr>
-        <w:t>QUADRO 4 – Fluxo de eventos do cenário “Vinculação do funcionário ao departamento responsável”</w:t>
-      </w:r>
-    </w:p>
-    <w:tbl>
-      <w:tblPr>
-        <w:tblStyle w:val="aff"/>
-        <w:tblW w:w="9022" w:type="dxa"/>
-        <w:tblInd w:w="-5" w:type="dxa"/>
-        <w:tblBorders>
-          <w:top w:val="single" w:sz="4" w:space="0" w:color="000000"/>
-          <w:left w:val="single" w:sz="4" w:space="0" w:color="000000"/>
-          <w:bottom w:val="single" w:sz="4" w:space="0" w:color="000000"/>
-          <w:right w:val="single" w:sz="4" w:space="0" w:color="000000"/>
-          <w:insideH w:val="single" w:sz="4" w:space="0" w:color="000000"/>
-          <w:insideV w:val="single" w:sz="4" w:space="0" w:color="000000"/>
-        </w:tblBorders>
-        <w:tblLayout w:type="fixed"/>
-        <w:tblLook w:val="0400" w:firstRow="0" w:lastRow="0" w:firstColumn="0" w:lastColumn="0" w:noHBand="0" w:noVBand="1"/>
-      </w:tblPr>
-      <w:tblGrid>
-        <w:gridCol w:w="2381"/>
-        <w:gridCol w:w="6641"/>
-      </w:tblGrid>
-      <w:tr>
-        <w:tc>
-          <w:tcPr>
-            <w:tcW w:w="2381" w:type="dxa"/>
-            <w:tcBorders>
-              <w:top w:val="single" w:sz="4" w:space="0" w:color="000000"/>
-              <w:left w:val="single" w:sz="4" w:space="0" w:color="000000"/>
-              <w:bottom w:val="single" w:sz="4" w:space="0" w:color="000000"/>
-              <w:right w:val="single" w:sz="4" w:space="0" w:color="000000"/>
-            </w:tcBorders>
-          </w:tcPr>
-          <w:p>
-            <w:r>
-              <w:t>Nome do caso de uso:</w:t>
-            </w:r>
-          </w:p>
-        </w:tc>
-        <w:tc>
-          <w:tcPr>
-            <w:tcW w:w="6641" w:type="dxa"/>
-            <w:tcBorders>
-              <w:top w:val="single" w:sz="4" w:space="0" w:color="000000"/>
-              <w:left w:val="single" w:sz="4" w:space="0" w:color="000000"/>
-              <w:bottom w:val="single" w:sz="4" w:space="0" w:color="000000"/>
-              <w:right w:val="single" w:sz="4" w:space="0" w:color="000000"/>
-            </w:tcBorders>
-          </w:tcPr>
-          <w:p>
-            <w:r>
-              <w:t>Criar conta da administração pública</w:t>
-            </w:r>
-          </w:p>
-        </w:tc>
-      </w:tr>
-      <w:tr>
-        <w:tc>
-          <w:tcPr>
-            <w:tcW w:w="2381" w:type="dxa"/>
-            <w:tcBorders>
-              <w:top w:val="single" w:sz="4" w:space="0" w:color="000000"/>
-              <w:left w:val="single" w:sz="4" w:space="0" w:color="000000"/>
-              <w:bottom w:val="single" w:sz="4" w:space="0" w:color="000000"/>
-              <w:right w:val="single" w:sz="4" w:space="0" w:color="000000"/>
-            </w:tcBorders>
-          </w:tcPr>
-          <w:p>
-            <w:r>
-              <w:t>Nome do cenário:</w:t>
-            </w:r>
-          </w:p>
-        </w:tc>
-        <w:tc>
-          <w:tcPr>
-            <w:tcW w:w="6641" w:type="dxa"/>
-            <w:tcBorders>
-              <w:top w:val="single" w:sz="4" w:space="0" w:color="000000"/>
-              <w:left w:val="single" w:sz="4" w:space="0" w:color="000000"/>
-              <w:bottom w:val="single" w:sz="4" w:space="0" w:color="000000"/>
-              <w:right w:val="single" w:sz="4" w:space="0" w:color="000000"/>
-            </w:tcBorders>
-          </w:tcPr>
-          <w:p>
-            <w:r>
-              <w:t>Criação de conta conforme o perfil de quem cadastra</w:t>
-            </w:r>
-          </w:p>
-        </w:tc>
-      </w:tr>
-      <w:tr>
-        <w:tc>
-          <w:tcPr>
-            <w:tcW w:w="2381" w:type="dxa"/>
-            <w:tcBorders>
-              <w:top w:val="single" w:sz="4" w:space="0" w:color="000000"/>
-              <w:left w:val="single" w:sz="4" w:space="0" w:color="000000"/>
-              <w:bottom w:val="single" w:sz="4" w:space="0" w:color="000000"/>
-              <w:right w:val="single" w:sz="4" w:space="0" w:color="000000"/>
-            </w:tcBorders>
-          </w:tcPr>
-          <w:p>
-            <w:r>
-              <w:t>Ator(es) envolvido(s):</w:t>
-            </w:r>
-          </w:p>
-        </w:tc>
-        <w:tc>
-          <w:tcPr>
-            <w:tcW w:w="6641" w:type="dxa"/>
-            <w:tcBorders>
-              <w:top w:val="single" w:sz="4" w:space="0" w:color="000000"/>
-              <w:left w:val="single" w:sz="4" w:space="0" w:color="000000"/>
-              <w:bottom w:val="single" w:sz="4" w:space="0" w:color="000000"/>
-              <w:right w:val="single" w:sz="4" w:space="0" w:color="000000"/>
-            </w:tcBorders>
-          </w:tcPr>
-          <w:p>
-            <w:r>
-              <w:t>Super Administrador; Administrador do município</w:t>
-            </w:r>
-          </w:p>
-        </w:tc>
-      </w:tr>
-      <w:tr>
-        <w:tc>
-          <w:tcPr>
-            <w:tcW w:w="2381" w:type="dxa"/>
-            <w:tcBorders>
-              <w:top w:val="single" w:sz="4" w:space="0" w:color="000000"/>
-              <w:left w:val="single" w:sz="4" w:space="0" w:color="000000"/>
-              <w:bottom w:val="single" w:sz="4" w:space="0" w:color="000000"/>
-              <w:right w:val="single" w:sz="4" w:space="0" w:color="000000"/>
-            </w:tcBorders>
-          </w:tcPr>
-          <w:p>
-            <w:r>
-              <w:t>Pré-condição:</w:t>
-            </w:r>
-          </w:p>
-        </w:tc>
-        <w:tc>
-          <w:tcPr>
-            <w:tcW w:w="6641" w:type="dxa"/>
-            <w:tcBorders>
-              <w:top w:val="single" w:sz="4" w:space="0" w:color="000000"/>
-              <w:left w:val="single" w:sz="4" w:space="0" w:color="000000"/>
-              <w:bottom w:val="single" w:sz="4" w:space="0" w:color="000000"/>
-              <w:right w:val="single" w:sz="4" w:space="0" w:color="000000"/>
-            </w:tcBorders>
-          </w:tcPr>
-          <w:p>
-            <w:r>
-              <w:t>O solicitante está autenticado com o perfil SUPER_ADMIN ou ADMINISTRATOR.</w:t>
-            </w:r>
-          </w:p>
-        </w:tc>
-      </w:tr>
-      <w:tr>
-        <w:tc>
-          <w:tcPr>
-            <w:tcW w:w="2381" w:type="dxa"/>
-            <w:tcBorders>
-              <w:top w:val="single" w:sz="4" w:space="0" w:color="000000"/>
-              <w:left w:val="single" w:sz="4" w:space="0" w:color="000000"/>
-              <w:bottom w:val="single" w:sz="4" w:space="0" w:color="000000"/>
-              <w:right w:val="single" w:sz="4" w:space="0" w:color="000000"/>
-            </w:tcBorders>
-          </w:tcPr>
-          <w:p>
-            <w:r>
-              <w:t>Pós-condição:</w:t>
-            </w:r>
-          </w:p>
-        </w:tc>
-        <w:tc>
-          <w:tcPr>
-            <w:tcW w:w="6641" w:type="dxa"/>
-            <w:tcBorders>
-              <w:top w:val="single" w:sz="4" w:space="0" w:color="000000"/>
-              <w:left w:val="single" w:sz="4" w:space="0" w:color="000000"/>
-              <w:bottom w:val="single" w:sz="4" w:space="0" w:color="000000"/>
-              <w:right w:val="single" w:sz="4" w:space="0" w:color="000000"/>
-            </w:tcBorders>
-          </w:tcPr>
-          <w:p>
-            <w:r>
-              <w:t>Conta criada com o perfil e o município correspondentes, com segundo fator exigido no primeiro acesso.</w:t>
-            </w:r>
-          </w:p>
-        </w:tc>
-      </w:tr>
-      <w:tr>
-        <w:tc>
-          <w:tcPr>
-            <w:tcW w:w="2381" w:type="dxa"/>
-            <w:tcBorders>
-              <w:top w:val="single" w:sz="4" w:space="0" w:color="000000"/>
-              <w:left w:val="single" w:sz="4" w:space="0" w:color="000000"/>
-              <w:bottom w:val="single" w:sz="4" w:space="0" w:color="000000"/>
-              <w:right w:val="single" w:sz="4" w:space="0" w:color="000000"/>
-            </w:tcBorders>
-          </w:tcPr>
-          <w:p>
-            <w:r>
-              <w:t>Ator</w:t>
-            </w:r>
-          </w:p>
-        </w:tc>
-        <w:tc>
-          <w:tcPr>
-            <w:tcW w:w="6641" w:type="dxa"/>
-            <w:tcBorders>
-              <w:top w:val="single" w:sz="4" w:space="0" w:color="000000"/>
-              <w:left w:val="single" w:sz="4" w:space="0" w:color="000000"/>
-              <w:bottom w:val="single" w:sz="4" w:space="0" w:color="000000"/>
-              <w:right w:val="single" w:sz="4" w:space="0" w:color="000000"/>
-            </w:tcBorders>
-          </w:tcPr>
-          <w:p>
-            <w:r>
-              <w:t>Sistema</w:t>
-            </w:r>
-          </w:p>
-        </w:tc>
-      </w:tr>
-      <w:tr>
-        <w:tc>
-          <w:tcPr>
-            <w:tcW w:w="2381" w:type="dxa"/>
-            <w:tcBorders>
-              <w:top w:val="single" w:sz="4" w:space="0" w:color="000000"/>
-              <w:left w:val="single" w:sz="4" w:space="0" w:color="000000"/>
-              <w:bottom w:val="single" w:sz="4" w:space="0" w:color="000000"/>
-              <w:right w:val="single" w:sz="4" w:space="0" w:color="000000"/>
-            </w:tcBorders>
-          </w:tcPr>
-          <w:p>
-            <w:r>
-              <w:t>1. O solicitante acessa “Criar Usuário”.</w:t>
-            </w:r>
-          </w:p>
-        </w:tc>
-        <w:tc>
-          <w:tcPr>
-            <w:tcW w:w="6641" w:type="dxa"/>
-            <w:tcBorders>
-              <w:top w:val="single" w:sz="4" w:space="0" w:color="000000"/>
-              <w:left w:val="single" w:sz="4" w:space="0" w:color="000000"/>
-              <w:bottom w:val="single" w:sz="4" w:space="0" w:color="000000"/>
-              <w:right w:val="single" w:sz="4" w:space="0" w:color="000000"/>
-            </w:tcBorders>
-          </w:tcPr>
-          <w:p>
-            <w:r/>
-          </w:p>
-        </w:tc>
-      </w:tr>
-      <w:tr>
-        <w:tc>
-          <w:tcPr>
-            <w:tcW w:w="2381" w:type="dxa"/>
-            <w:tcBorders>
-              <w:top w:val="single" w:sz="4" w:space="0" w:color="000000"/>
-              <w:left w:val="single" w:sz="4" w:space="0" w:color="000000"/>
-              <w:bottom w:val="single" w:sz="4" w:space="0" w:color="000000"/>
-              <w:right w:val="single" w:sz="4" w:space="0" w:color="000000"/>
-            </w:tcBorders>
-          </w:tcPr>
-          <w:p>
-            <w:r/>
-          </w:p>
-        </w:tc>
-        <w:tc>
-          <w:tcPr>
-            <w:tcW w:w="6641" w:type="dxa"/>
-            <w:tcBorders>
-              <w:top w:val="single" w:sz="4" w:space="0" w:color="000000"/>
-              <w:left w:val="single" w:sz="4" w:space="0" w:color="000000"/>
-              <w:bottom w:val="single" w:sz="4" w:space="0" w:color="000000"/>
-              <w:right w:val="single" w:sz="4" w:space="0" w:color="000000"/>
-            </w:tcBorders>
-          </w:tcPr>
-          <w:p>
-            <w:r>
-              <w:t>2. O sistema apresenta os perfis que o solicitante pode criar: ao Super Administrador, funcionário, administrador do município e Super Administrador; ao administrador municipal, apenas funcionário, com o município preenchido e bloqueado.</w:t>
-            </w:r>
-          </w:p>
-        </w:tc>
-      </w:tr>
-      <w:tr>
-        <w:tc>
-          <w:tcPr>
-            <w:tcW w:w="2381" w:type="dxa"/>
-            <w:tcBorders>
-              <w:top w:val="single" w:sz="4" w:space="0" w:color="000000"/>
-              <w:left w:val="single" w:sz="4" w:space="0" w:color="000000"/>
-              <w:bottom w:val="single" w:sz="4" w:space="0" w:color="000000"/>
-              <w:right w:val="single" w:sz="4" w:space="0" w:color="000000"/>
-            </w:tcBorders>
-          </w:tcPr>
-          <w:p>
-            <w:r>
-              <w:t>3. O solicitante informa nome, endereço de correio eletrônico, senha inicial, perfil e, quando couber, a unidade federativa e o município.</w:t>
-            </w:r>
-          </w:p>
-        </w:tc>
-        <w:tc>
-          <w:tcPr>
-            <w:tcW w:w="6641" w:type="dxa"/>
-            <w:tcBorders>
-              <w:top w:val="single" w:sz="4" w:space="0" w:color="000000"/>
-              <w:left w:val="single" w:sz="4" w:space="0" w:color="000000"/>
-              <w:bottom w:val="single" w:sz="4" w:space="0" w:color="000000"/>
-              <w:right w:val="single" w:sz="4" w:space="0" w:color="000000"/>
-            </w:tcBorders>
-          </w:tcPr>
-          <w:p>
-            <w:r/>
-          </w:p>
-        </w:tc>
-      </w:tr>
-      <w:tr>
-        <w:tc>
-          <w:tcPr>
-            <w:tcW w:w="2381" w:type="dxa"/>
-            <w:tcBorders>
-              <w:top w:val="single" w:sz="4" w:space="0" w:color="000000"/>
-              <w:left w:val="single" w:sz="4" w:space="0" w:color="000000"/>
-              <w:bottom w:val="single" w:sz="4" w:space="0" w:color="000000"/>
-              <w:right w:val="single" w:sz="4" w:space="0" w:color="000000"/>
-            </w:tcBorders>
-          </w:tcPr>
-          <w:p>
-            <w:r/>
-          </w:p>
-        </w:tc>
-        <w:tc>
-          <w:tcPr>
-            <w:tcW w:w="6641" w:type="dxa"/>
-            <w:tcBorders>
-              <w:top w:val="single" w:sz="4" w:space="0" w:color="000000"/>
-              <w:left w:val="single" w:sz="4" w:space="0" w:color="000000"/>
-              <w:bottom w:val="single" w:sz="4" w:space="0" w:color="000000"/>
-              <w:right w:val="single" w:sz="4" w:space="0" w:color="000000"/>
-            </w:tcBorders>
-          </w:tcPr>
-          <w:p>
-            <w:r>
-              <w:t>4. O sistema valida os dados, cria a conta e expede mensagem de boas-vindas com a orientação de configurar o segundo fator no primeiro acesso.</w:t>
-            </w:r>
-          </w:p>
-        </w:tc>
-      </w:tr>
-      <w:tr>
-        <w:tc>
-          <w:tcPr>
-            <w:tcW w:w="2381" w:type="dxa"/>
-            <w:tcBorders>
-              <w:top w:val="single" w:sz="4" w:space="0" w:color="000000"/>
-              <w:left w:val="single" w:sz="4" w:space="0" w:color="000000"/>
-              <w:bottom w:val="single" w:sz="4" w:space="0" w:color="000000"/>
-              <w:right w:val="single" w:sz="4" w:space="0" w:color="000000"/>
-            </w:tcBorders>
-          </w:tcPr>
-          <w:p>
-            <w:r/>
-          </w:p>
-        </w:tc>
-        <w:tc>
-          <w:tcPr>
-            <w:tcW w:w="6641" w:type="dxa"/>
-            <w:tcBorders>
-              <w:top w:val="single" w:sz="4" w:space="0" w:color="000000"/>
-              <w:left w:val="single" w:sz="4" w:space="0" w:color="000000"/>
-              <w:bottom w:val="single" w:sz="4" w:space="0" w:color="000000"/>
-              <w:right w:val="single" w:sz="4" w:space="0" w:color="000000"/>
-            </w:tcBorders>
-          </w:tcPr>
-          <w:p>
-            <w:r>
-              <w:t>5. Fluxo alternativo — perfil de administrador solicitado por administrador municipal: o sistema recusa a operação, privativa do Super Administrador.</w:t>
-            </w:r>
-          </w:p>
-        </w:tc>
-      </w:tr>
-      <w:tr>
-        <w:tc>
-          <w:tcPr>
-            <w:tcW w:w="2381" w:type="dxa"/>
-            <w:tcBorders>
-              <w:top w:val="single" w:sz="4" w:space="0" w:color="000000"/>
-              <w:left w:val="single" w:sz="4" w:space="0" w:color="000000"/>
-              <w:bottom w:val="single" w:sz="4" w:space="0" w:color="000000"/>
-              <w:right w:val="single" w:sz="4" w:space="0" w:color="000000"/>
-            </w:tcBorders>
-          </w:tcPr>
-          <w:p>
-            <w:r/>
-          </w:p>
-        </w:tc>
-        <w:tc>
-          <w:tcPr>
-            <w:tcW w:w="6641" w:type="dxa"/>
-            <w:tcBorders>
-              <w:top w:val="single" w:sz="4" w:space="0" w:color="000000"/>
-              <w:left w:val="single" w:sz="4" w:space="0" w:color="000000"/>
-              <w:bottom w:val="single" w:sz="4" w:space="0" w:color="000000"/>
-              <w:right w:val="single" w:sz="4" w:space="0" w:color="000000"/>
-            </w:tcBorders>
-          </w:tcPr>
-          <w:p>
-            <w:r>
-              <w:t>6. Fluxo alternativo — município diverso do solicitante: o sistema recusa a operação.</w:t>
-            </w:r>
-          </w:p>
-        </w:tc>
-      </w:tr>
-      <w:tr>
-        <w:tc>
-          <w:tcPr>
-            <w:tcW w:w="2381" w:type="dxa"/>
-            <w:tcBorders>
-              <w:top w:val="single" w:sz="4" w:space="0" w:color="000000"/>
-              <w:left w:val="single" w:sz="4" w:space="0" w:color="000000"/>
-              <w:bottom w:val="single" w:sz="4" w:space="0" w:color="000000"/>
-              <w:right w:val="single" w:sz="4" w:space="0" w:color="000000"/>
-            </w:tcBorders>
-          </w:tcPr>
-          <w:p>
-            <w:r/>
-          </w:p>
-        </w:tc>
-        <w:tc>
-          <w:tcPr>
-            <w:tcW w:w="6641" w:type="dxa"/>
-            <w:tcBorders>
-              <w:top w:val="single" w:sz="4" w:space="0" w:color="000000"/>
-              <w:left w:val="single" w:sz="4" w:space="0" w:color="000000"/>
-              <w:bottom w:val="single" w:sz="4" w:space="0" w:color="000000"/>
-              <w:right w:val="single" w:sz="4" w:space="0" w:color="000000"/>
-            </w:tcBorders>
-          </w:tcPr>
-          <w:p>
-            <w:r>
-              <w:t>7. Fluxo alternativo — endereço de correio eletrônico já cadastrado: o sistema informa a duplicidade e mantém a conta existente.</w:t>
-            </w:r>
-          </w:p>
-        </w:tc>
-      </w:tr>
-    </w:tbl>
-    <w:p>
-      <w:r>
-        <w:rPr>
-          <w:sz w:val="18"/>
-        </w:rPr>
-        <w:t>QUADRO 5 – Fluxo de eventos do cenário “Criação de conta conforme o perfil de quem cadastra”</w:t>
+        <w:t>QUADRO 4 – Fluxo de eventos do cenário “Inativação de conta pelo administrador”</w:t>
       </w:r>
     </w:p>
     <w:p/>
@@ -2522,7 +2495,12 @@
             </w:tcBorders>
           </w:tcPr>
           <w:p>
-            <w:r>
+            <w:r/>
+            <w:r>
+              <w:rPr>
+                <w:b/>
+                <w:sz w:val="20"/>
+              </w:rPr>
               <w:t>Nome do caso de uso:</w:t>
             </w:r>
           </w:p>
@@ -2538,25 +2516,35 @@
             </w:tcBorders>
           </w:tcPr>
           <w:p>
-            <w:r>
-              <w:t>Consultar e inativar contas</w:t>
-            </w:r>
-          </w:p>
-        </w:tc>
-      </w:tr>
-      <w:tr>
-        <w:tc>
-          <w:tcPr>
-            <w:tcW w:w="2381" w:type="dxa"/>
-            <w:tcBorders>
-              <w:top w:val="single" w:sz="4" w:space="0" w:color="000000"/>
-              <w:left w:val="single" w:sz="4" w:space="0" w:color="000000"/>
-              <w:bottom w:val="single" w:sz="4" w:space="0" w:color="000000"/>
-              <w:right w:val="single" w:sz="4" w:space="0" w:color="000000"/>
-            </w:tcBorders>
-          </w:tcPr>
-          <w:p>
-            <w:r>
+            <w:r/>
+            <w:r>
+              <w:rPr>
+                <w:b w:val="0"/>
+                <w:sz w:val="20"/>
+              </w:rPr>
+              <w:t>Relacionar usuário à instituição</w:t>
+            </w:r>
+          </w:p>
+        </w:tc>
+      </w:tr>
+      <w:tr>
+        <w:tc>
+          <w:tcPr>
+            <w:tcW w:w="2381" w:type="dxa"/>
+            <w:tcBorders>
+              <w:top w:val="single" w:sz="4" w:space="0" w:color="000000"/>
+              <w:left w:val="single" w:sz="4" w:space="0" w:color="000000"/>
+              <w:bottom w:val="single" w:sz="4" w:space="0" w:color="000000"/>
+              <w:right w:val="single" w:sz="4" w:space="0" w:color="000000"/>
+            </w:tcBorders>
+          </w:tcPr>
+          <w:p>
+            <w:r/>
+            <w:r>
+              <w:rPr>
+                <w:b/>
+                <w:sz w:val="20"/>
+              </w:rPr>
               <w:t>Nome do cenário:</w:t>
             </w:r>
           </w:p>
@@ -2572,25 +2560,35 @@
             </w:tcBorders>
           </w:tcPr>
           <w:p>
-            <w:r>
-              <w:t>Manutenção das contas dentro do alcance do solicitante</w:t>
-            </w:r>
-          </w:p>
-        </w:tc>
-      </w:tr>
-      <w:tr>
-        <w:tc>
-          <w:tcPr>
-            <w:tcW w:w="2381" w:type="dxa"/>
-            <w:tcBorders>
-              <w:top w:val="single" w:sz="4" w:space="0" w:color="000000"/>
-              <w:left w:val="single" w:sz="4" w:space="0" w:color="000000"/>
-              <w:bottom w:val="single" w:sz="4" w:space="0" w:color="000000"/>
-              <w:right w:val="single" w:sz="4" w:space="0" w:color="000000"/>
-            </w:tcBorders>
-          </w:tcPr>
-          <w:p>
-            <w:r>
+            <w:r/>
+            <w:r>
+              <w:rPr>
+                <w:b w:val="0"/>
+                <w:sz w:val="20"/>
+              </w:rPr>
+              <w:t>Vinculação do funcionário ao departamento responsável</w:t>
+            </w:r>
+          </w:p>
+        </w:tc>
+      </w:tr>
+      <w:tr>
+        <w:tc>
+          <w:tcPr>
+            <w:tcW w:w="2381" w:type="dxa"/>
+            <w:tcBorders>
+              <w:top w:val="single" w:sz="4" w:space="0" w:color="000000"/>
+              <w:left w:val="single" w:sz="4" w:space="0" w:color="000000"/>
+              <w:bottom w:val="single" w:sz="4" w:space="0" w:color="000000"/>
+              <w:right w:val="single" w:sz="4" w:space="0" w:color="000000"/>
+            </w:tcBorders>
+          </w:tcPr>
+          <w:p>
+            <w:r/>
+            <w:r>
+              <w:rPr>
+                <w:b/>
+                <w:sz w:val="20"/>
+              </w:rPr>
               <w:t>Ator(es) envolvido(s):</w:t>
             </w:r>
           </w:p>
@@ -2606,25 +2604,35 @@
             </w:tcBorders>
           </w:tcPr>
           <w:p>
-            <w:r>
-              <w:t>Super Administrador; Administrador do município</w:t>
-            </w:r>
-          </w:p>
-        </w:tc>
-      </w:tr>
-      <w:tr>
-        <w:tc>
-          <w:tcPr>
-            <w:tcW w:w="2381" w:type="dxa"/>
-            <w:tcBorders>
-              <w:top w:val="single" w:sz="4" w:space="0" w:color="000000"/>
-              <w:left w:val="single" w:sz="4" w:space="0" w:color="000000"/>
-              <w:bottom w:val="single" w:sz="4" w:space="0" w:color="000000"/>
-              <w:right w:val="single" w:sz="4" w:space="0" w:color="000000"/>
-            </w:tcBorders>
-          </w:tcPr>
-          <w:p>
-            <w:r>
+            <w:r/>
+            <w:r>
+              <w:rPr>
+                <w:b w:val="0"/>
+                <w:sz w:val="20"/>
+              </w:rPr>
+              <w:t>Administrador</w:t>
+            </w:r>
+          </w:p>
+        </w:tc>
+      </w:tr>
+      <w:tr>
+        <w:tc>
+          <w:tcPr>
+            <w:tcW w:w="2381" w:type="dxa"/>
+            <w:tcBorders>
+              <w:top w:val="single" w:sz="4" w:space="0" w:color="000000"/>
+              <w:left w:val="single" w:sz="4" w:space="0" w:color="000000"/>
+              <w:bottom w:val="single" w:sz="4" w:space="0" w:color="000000"/>
+              <w:right w:val="single" w:sz="4" w:space="0" w:color="000000"/>
+            </w:tcBorders>
+          </w:tcPr>
+          <w:p>
+            <w:r/>
+            <w:r>
+              <w:rPr>
+                <w:b/>
+                <w:sz w:val="20"/>
+              </w:rPr>
               <w:t>Pré-condição:</w:t>
             </w:r>
           </w:p>
@@ -2640,25 +2648,35 @@
             </w:tcBorders>
           </w:tcPr>
           <w:p>
-            <w:r>
-              <w:t>O solicitante está autenticado com o perfil SUPER_ADMIN ou ADMINISTRATOR.</w:t>
-            </w:r>
-          </w:p>
-        </w:tc>
-      </w:tr>
-      <w:tr>
-        <w:tc>
-          <w:tcPr>
-            <w:tcW w:w="2381" w:type="dxa"/>
-            <w:tcBorders>
-              <w:top w:val="single" w:sz="4" w:space="0" w:color="000000"/>
-              <w:left w:val="single" w:sz="4" w:space="0" w:color="000000"/>
-              <w:bottom w:val="single" w:sz="4" w:space="0" w:color="000000"/>
-              <w:right w:val="single" w:sz="4" w:space="0" w:color="000000"/>
-            </w:tcBorders>
-          </w:tcPr>
-          <w:p>
-            <w:r>
+            <w:r/>
+            <w:r>
+              <w:rPr>
+                <w:b w:val="0"/>
+                <w:sz w:val="20"/>
+              </w:rPr>
+              <w:t>Existem departamentos cadastrados e conta com o perfil EMPLOYEE.</w:t>
+            </w:r>
+          </w:p>
+        </w:tc>
+      </w:tr>
+      <w:tr>
+        <w:tc>
+          <w:tcPr>
+            <w:tcW w:w="2381" w:type="dxa"/>
+            <w:tcBorders>
+              <w:top w:val="single" w:sz="4" w:space="0" w:color="000000"/>
+              <w:left w:val="single" w:sz="4" w:space="0" w:color="000000"/>
+              <w:bottom w:val="single" w:sz="4" w:space="0" w:color="000000"/>
+              <w:right w:val="single" w:sz="4" w:space="0" w:color="000000"/>
+            </w:tcBorders>
+          </w:tcPr>
+          <w:p>
+            <w:r/>
+            <w:r>
+              <w:rPr>
+                <w:b/>
+                <w:sz w:val="20"/>
+              </w:rPr>
               <w:t>Pós-condição:</w:t>
             </w:r>
           </w:p>
@@ -2674,25 +2692,35 @@
             </w:tcBorders>
           </w:tcPr>
           <w:p>
-            <w:r>
-              <w:t>Situação da conta alterada, preservados os dados e o histórico.</w:t>
-            </w:r>
-          </w:p>
-        </w:tc>
-      </w:tr>
-      <w:tr>
-        <w:tc>
-          <w:tcPr>
-            <w:tcW w:w="2381" w:type="dxa"/>
-            <w:tcBorders>
-              <w:top w:val="single" w:sz="4" w:space="0" w:color="000000"/>
-              <w:left w:val="single" w:sz="4" w:space="0" w:color="000000"/>
-              <w:bottom w:val="single" w:sz="4" w:space="0" w:color="000000"/>
-              <w:right w:val="single" w:sz="4" w:space="0" w:color="000000"/>
-            </w:tcBorders>
-          </w:tcPr>
-          <w:p>
-            <w:r>
+            <w:r/>
+            <w:r>
+              <w:rPr>
+                <w:b w:val="0"/>
+                <w:sz w:val="20"/>
+              </w:rPr>
+              <w:t>Funcionário vinculado ao departamento, que passa a receber as ocorrências das categorias correspondentes.</w:t>
+            </w:r>
+          </w:p>
+        </w:tc>
+      </w:tr>
+      <w:tr>
+        <w:tc>
+          <w:tcPr>
+            <w:tcW w:w="2381" w:type="dxa"/>
+            <w:tcBorders>
+              <w:top w:val="single" w:sz="4" w:space="0" w:color="000000"/>
+              <w:left w:val="single" w:sz="4" w:space="0" w:color="000000"/>
+              <w:bottom w:val="single" w:sz="4" w:space="0" w:color="000000"/>
+              <w:right w:val="single" w:sz="4" w:space="0" w:color="000000"/>
+            </w:tcBorders>
+          </w:tcPr>
+          <w:p>
+            <w:r/>
+            <w:r>
+              <w:rPr>
+                <w:b/>
+                <w:sz w:val="20"/>
+              </w:rPr>
               <w:t>Ator</w:t>
             </w:r>
           </w:p>
@@ -2708,7 +2736,12 @@
             </w:tcBorders>
           </w:tcPr>
           <w:p>
-            <w:r>
+            <w:r/>
+            <w:r>
+              <w:rPr>
+                <w:b/>
+                <w:sz w:val="20"/>
+              </w:rPr>
               <w:t>Sistema</w:t>
             </w:r>
           </w:p>
@@ -2726,150 +2759,162 @@
             </w:tcBorders>
           </w:tcPr>
           <w:p>
-            <w:r>
-              <w:t>1. O solicitante acessa a relação de usuários.</w:t>
-            </w:r>
-          </w:p>
-        </w:tc>
-        <w:tc>
-          <w:tcPr>
-            <w:tcW w:w="6641" w:type="dxa"/>
-            <w:tcBorders>
-              <w:top w:val="single" w:sz="4" w:space="0" w:color="000000"/>
-              <w:left w:val="single" w:sz="4" w:space="0" w:color="000000"/>
-              <w:bottom w:val="single" w:sz="4" w:space="0" w:color="000000"/>
-              <w:right w:val="single" w:sz="4" w:space="0" w:color="000000"/>
-            </w:tcBorders>
-          </w:tcPr>
-          <w:p>
-            <w:r/>
-          </w:p>
-        </w:tc>
-      </w:tr>
-      <w:tr>
-        <w:tc>
-          <w:tcPr>
-            <w:tcW w:w="2381" w:type="dxa"/>
-            <w:tcBorders>
-              <w:top w:val="single" w:sz="4" w:space="0" w:color="000000"/>
-              <w:left w:val="single" w:sz="4" w:space="0" w:color="000000"/>
-              <w:bottom w:val="single" w:sz="4" w:space="0" w:color="000000"/>
-              <w:right w:val="single" w:sz="4" w:space="0" w:color="000000"/>
-            </w:tcBorders>
-          </w:tcPr>
-          <w:p>
-            <w:r/>
-          </w:p>
-        </w:tc>
-        <w:tc>
-          <w:tcPr>
-            <w:tcW w:w="6641" w:type="dxa"/>
-            <w:tcBorders>
-              <w:top w:val="single" w:sz="4" w:space="0" w:color="000000"/>
-              <w:left w:val="single" w:sz="4" w:space="0" w:color="000000"/>
-              <w:bottom w:val="single" w:sz="4" w:space="0" w:color="000000"/>
-              <w:right w:val="single" w:sz="4" w:space="0" w:color="000000"/>
-            </w:tcBorders>
-          </w:tcPr>
-          <w:p>
-            <w:r>
-              <w:t>2. O sistema apresenta todas as contas ao Super Administrador e, ao administrador municipal, apenas as vinculadas ao seu município, excluídas as de Super Administrador.</w:t>
-            </w:r>
-          </w:p>
-        </w:tc>
-      </w:tr>
-      <w:tr>
-        <w:tc>
-          <w:tcPr>
-            <w:tcW w:w="2381" w:type="dxa"/>
-            <w:tcBorders>
-              <w:top w:val="single" w:sz="4" w:space="0" w:color="000000"/>
-              <w:left w:val="single" w:sz="4" w:space="0" w:color="000000"/>
-              <w:bottom w:val="single" w:sz="4" w:space="0" w:color="000000"/>
-              <w:right w:val="single" w:sz="4" w:space="0" w:color="000000"/>
-            </w:tcBorders>
-          </w:tcPr>
-          <w:p>
-            <w:r>
-              <w:t>3. O solicitante aciona a ativação ou a inativação de uma conta.</w:t>
-            </w:r>
-          </w:p>
-        </w:tc>
-        <w:tc>
-          <w:tcPr>
-            <w:tcW w:w="6641" w:type="dxa"/>
-            <w:tcBorders>
-              <w:top w:val="single" w:sz="4" w:space="0" w:color="000000"/>
-              <w:left w:val="single" w:sz="4" w:space="0" w:color="000000"/>
-              <w:bottom w:val="single" w:sz="4" w:space="0" w:color="000000"/>
-              <w:right w:val="single" w:sz="4" w:space="0" w:color="000000"/>
-            </w:tcBorders>
-          </w:tcPr>
-          <w:p>
-            <w:r/>
-          </w:p>
-        </w:tc>
-      </w:tr>
-      <w:tr>
-        <w:tc>
-          <w:tcPr>
-            <w:tcW w:w="2381" w:type="dxa"/>
-            <w:tcBorders>
-              <w:top w:val="single" w:sz="4" w:space="0" w:color="000000"/>
-              <w:left w:val="single" w:sz="4" w:space="0" w:color="000000"/>
-              <w:bottom w:val="single" w:sz="4" w:space="0" w:color="000000"/>
-              <w:right w:val="single" w:sz="4" w:space="0" w:color="000000"/>
-            </w:tcBorders>
-          </w:tcPr>
-          <w:p>
-            <w:r/>
-          </w:p>
-        </w:tc>
-        <w:tc>
-          <w:tcPr>
-            <w:tcW w:w="6641" w:type="dxa"/>
-            <w:tcBorders>
-              <w:top w:val="single" w:sz="4" w:space="0" w:color="000000"/>
-              <w:left w:val="single" w:sz="4" w:space="0" w:color="000000"/>
-              <w:bottom w:val="single" w:sz="4" w:space="0" w:color="000000"/>
-              <w:right w:val="single" w:sz="4" w:space="0" w:color="000000"/>
-            </w:tcBorders>
-          </w:tcPr>
-          <w:p>
-            <w:r>
-              <w:t>4. O sistema altera a situação da conta e impede o acesso enquanto ela estiver inativa, sem excluir os dados.</w:t>
-            </w:r>
-          </w:p>
-        </w:tc>
-      </w:tr>
-      <w:tr>
-        <w:tc>
-          <w:tcPr>
-            <w:tcW w:w="2381" w:type="dxa"/>
-            <w:tcBorders>
-              <w:top w:val="single" w:sz="4" w:space="0" w:color="000000"/>
-              <w:left w:val="single" w:sz="4" w:space="0" w:color="000000"/>
-              <w:bottom w:val="single" w:sz="4" w:space="0" w:color="000000"/>
-              <w:right w:val="single" w:sz="4" w:space="0" w:color="000000"/>
-            </w:tcBorders>
-          </w:tcPr>
-          <w:p>
-            <w:r/>
-          </w:p>
-        </w:tc>
-        <w:tc>
-          <w:tcPr>
-            <w:tcW w:w="6641" w:type="dxa"/>
-            <w:tcBorders>
-              <w:top w:val="single" w:sz="4" w:space="0" w:color="000000"/>
-              <w:left w:val="single" w:sz="4" w:space="0" w:color="000000"/>
-              <w:bottom w:val="single" w:sz="4" w:space="0" w:color="000000"/>
-              <w:right w:val="single" w:sz="4" w:space="0" w:color="000000"/>
-            </w:tcBorders>
-          </w:tcPr>
-          <w:p>
-            <w:r>
-              <w:t>5. Fluxo alternativo — conta fora do alcance do solicitante: o sistema recusa a operação.</w:t>
+            <w:r/>
+            <w:r>
+              <w:rPr>
+                <w:b w:val="0"/>
+                <w:sz w:val="20"/>
+              </w:rPr>
+              <w:t>1. O administrador seleciona a conta do funcionário na gestão de usuários.</w:t>
+            </w:r>
+          </w:p>
+        </w:tc>
+        <w:tc>
+          <w:tcPr>
+            <w:tcW w:w="6641" w:type="dxa"/>
+            <w:tcBorders>
+              <w:top w:val="single" w:sz="4" w:space="0" w:color="000000"/>
+              <w:left w:val="single" w:sz="4" w:space="0" w:color="000000"/>
+              <w:bottom w:val="single" w:sz="4" w:space="0" w:color="000000"/>
+              <w:right w:val="single" w:sz="4" w:space="0" w:color="000000"/>
+            </w:tcBorders>
+          </w:tcPr>
+          <w:p>
+            <w:r/>
+            <w:r>
+              <w:rPr>
+                <w:b w:val="0"/>
+                <w:sz w:val="20"/>
+              </w:rPr>
+            </w:r>
+          </w:p>
+        </w:tc>
+      </w:tr>
+      <w:tr>
+        <w:tc>
+          <w:tcPr>
+            <w:tcW w:w="2381" w:type="dxa"/>
+            <w:tcBorders>
+              <w:top w:val="single" w:sz="4" w:space="0" w:color="000000"/>
+              <w:left w:val="single" w:sz="4" w:space="0" w:color="000000"/>
+              <w:bottom w:val="single" w:sz="4" w:space="0" w:color="000000"/>
+              <w:right w:val="single" w:sz="4" w:space="0" w:color="000000"/>
+            </w:tcBorders>
+          </w:tcPr>
+          <w:p>
+            <w:r/>
+            <w:r>
+              <w:rPr>
+                <w:b w:val="0"/>
+                <w:sz w:val="20"/>
+              </w:rPr>
+              <w:t>2. O administrador escolhe o departamento de lotação.</w:t>
+            </w:r>
+          </w:p>
+        </w:tc>
+        <w:tc>
+          <w:tcPr>
+            <w:tcW w:w="6641" w:type="dxa"/>
+            <w:tcBorders>
+              <w:top w:val="single" w:sz="4" w:space="0" w:color="000000"/>
+              <w:left w:val="single" w:sz="4" w:space="0" w:color="000000"/>
+              <w:bottom w:val="single" w:sz="4" w:space="0" w:color="000000"/>
+              <w:right w:val="single" w:sz="4" w:space="0" w:color="000000"/>
+            </w:tcBorders>
+          </w:tcPr>
+          <w:p>
+            <w:r/>
+            <w:r>
+              <w:rPr>
+                <w:b w:val="0"/>
+                <w:sz w:val="20"/>
+              </w:rPr>
+            </w:r>
+          </w:p>
+        </w:tc>
+      </w:tr>
+      <w:tr>
+        <w:tc>
+          <w:tcPr>
+            <w:tcW w:w="2381" w:type="dxa"/>
+            <w:tcBorders>
+              <w:top w:val="single" w:sz="4" w:space="0" w:color="000000"/>
+              <w:left w:val="single" w:sz="4" w:space="0" w:color="000000"/>
+              <w:bottom w:val="single" w:sz="4" w:space="0" w:color="000000"/>
+              <w:right w:val="single" w:sz="4" w:space="0" w:color="000000"/>
+            </w:tcBorders>
+          </w:tcPr>
+          <w:p>
+            <w:r/>
+            <w:r>
+              <w:rPr>
+                <w:b w:val="0"/>
+                <w:sz w:val="20"/>
+              </w:rPr>
+            </w:r>
+          </w:p>
+        </w:tc>
+        <w:tc>
+          <w:tcPr>
+            <w:tcW w:w="6641" w:type="dxa"/>
+            <w:tcBorders>
+              <w:top w:val="single" w:sz="4" w:space="0" w:color="000000"/>
+              <w:left w:val="single" w:sz="4" w:space="0" w:color="000000"/>
+              <w:bottom w:val="single" w:sz="4" w:space="0" w:color="000000"/>
+              <w:right w:val="single" w:sz="4" w:space="0" w:color="000000"/>
+            </w:tcBorders>
+          </w:tcPr>
+          <w:p>
+            <w:r/>
+            <w:r>
+              <w:rPr>
+                <w:b w:val="0"/>
+                <w:sz w:val="20"/>
+              </w:rPr>
+              <w:t>3. O sistema grava o vínculo entre a conta e o departamento.</w:t>
+            </w:r>
+          </w:p>
+        </w:tc>
+      </w:tr>
+      <w:tr>
+        <w:tc>
+          <w:tcPr>
+            <w:tcW w:w="2381" w:type="dxa"/>
+            <w:tcBorders>
+              <w:top w:val="single" w:sz="4" w:space="0" w:color="000000"/>
+              <w:left w:val="single" w:sz="4" w:space="0" w:color="000000"/>
+              <w:bottom w:val="single" w:sz="4" w:space="0" w:color="000000"/>
+              <w:right w:val="single" w:sz="4" w:space="0" w:color="000000"/>
+            </w:tcBorders>
+          </w:tcPr>
+          <w:p>
+            <w:r/>
+            <w:r>
+              <w:rPr>
+                <w:b w:val="0"/>
+                <w:sz w:val="20"/>
+              </w:rPr>
+            </w:r>
+          </w:p>
+        </w:tc>
+        <w:tc>
+          <w:tcPr>
+            <w:tcW w:w="6641" w:type="dxa"/>
+            <w:tcBorders>
+              <w:top w:val="single" w:sz="4" w:space="0" w:color="000000"/>
+              <w:left w:val="single" w:sz="4" w:space="0" w:color="000000"/>
+              <w:bottom w:val="single" w:sz="4" w:space="0" w:color="000000"/>
+              <w:right w:val="single" w:sz="4" w:space="0" w:color="000000"/>
+            </w:tcBorders>
+          </w:tcPr>
+          <w:p>
+            <w:r/>
+            <w:r>
+              <w:rPr>
+                <w:b w:val="0"/>
+                <w:sz w:val="20"/>
+              </w:rPr>
+              <w:t>4. O sistema passa a apresentar ao funcionário, de forma destacada, as ocorrências das categorias atribuídas ao seu departamento.</w:t>
             </w:r>
           </w:p>
         </w:tc>
@@ -2880,7 +2925,890 @@
         <w:rPr>
           <w:sz w:val="18"/>
         </w:rPr>
-        <w:t>QUADRO 6 – Fluxo de eventos do cenário “Manutenção das contas dentro do alcance do solicitante”</w:t>
+        <w:t>QUADRO 5 – Fluxo de eventos do cenário “Vinculação do funcionário ao departamento responsável”</w:t>
+      </w:r>
+    </w:p>
+    <w:tbl>
+      <w:tblPr>
+        <w:tblStyle w:val="aff"/>
+        <w:tblW w:w="9022" w:type="dxa"/>
+        <w:tblInd w:w="-5" w:type="dxa"/>
+        <w:tblBorders>
+          <w:top w:val="single" w:sz="4" w:space="0" w:color="000000"/>
+          <w:left w:val="single" w:sz="4" w:space="0" w:color="000000"/>
+          <w:bottom w:val="single" w:sz="4" w:space="0" w:color="000000"/>
+          <w:right w:val="single" w:sz="4" w:space="0" w:color="000000"/>
+          <w:insideH w:val="single" w:sz="4" w:space="0" w:color="000000"/>
+          <w:insideV w:val="single" w:sz="4" w:space="0" w:color="000000"/>
+        </w:tblBorders>
+        <w:tblLayout w:type="fixed"/>
+        <w:tblLook w:val="0400" w:firstRow="0" w:lastRow="0" w:firstColumn="0" w:lastColumn="0" w:noHBand="0" w:noVBand="1"/>
+      </w:tblPr>
+      <w:tblGrid>
+        <w:gridCol w:w="2381"/>
+        <w:gridCol w:w="6641"/>
+      </w:tblGrid>
+      <w:tr>
+        <w:tc>
+          <w:tcPr>
+            <w:tcW w:w="2381" w:type="dxa"/>
+            <w:tcBorders>
+              <w:top w:val="single" w:sz="4" w:space="0" w:color="000000"/>
+              <w:left w:val="single" w:sz="4" w:space="0" w:color="000000"/>
+              <w:bottom w:val="single" w:sz="4" w:space="0" w:color="000000"/>
+              <w:right w:val="single" w:sz="4" w:space="0" w:color="000000"/>
+            </w:tcBorders>
+          </w:tcPr>
+          <w:p>
+            <w:r>
+              <w:t>Nome do caso de uso:</w:t>
+            </w:r>
+          </w:p>
+        </w:tc>
+        <w:tc>
+          <w:tcPr>
+            <w:tcW w:w="6641" w:type="dxa"/>
+            <w:tcBorders>
+              <w:top w:val="single" w:sz="4" w:space="0" w:color="000000"/>
+              <w:left w:val="single" w:sz="4" w:space="0" w:color="000000"/>
+              <w:bottom w:val="single" w:sz="4" w:space="0" w:color="000000"/>
+              <w:right w:val="single" w:sz="4" w:space="0" w:color="000000"/>
+            </w:tcBorders>
+          </w:tcPr>
+          <w:p>
+            <w:r>
+              <w:t>Criar conta da administração pública</w:t>
+            </w:r>
+          </w:p>
+        </w:tc>
+      </w:tr>
+      <w:tr>
+        <w:tc>
+          <w:tcPr>
+            <w:tcW w:w="2381" w:type="dxa"/>
+            <w:tcBorders>
+              <w:top w:val="single" w:sz="4" w:space="0" w:color="000000"/>
+              <w:left w:val="single" w:sz="4" w:space="0" w:color="000000"/>
+              <w:bottom w:val="single" w:sz="4" w:space="0" w:color="000000"/>
+              <w:right w:val="single" w:sz="4" w:space="0" w:color="000000"/>
+            </w:tcBorders>
+          </w:tcPr>
+          <w:p>
+            <w:r>
+              <w:t>Nome do cenário:</w:t>
+            </w:r>
+          </w:p>
+        </w:tc>
+        <w:tc>
+          <w:tcPr>
+            <w:tcW w:w="6641" w:type="dxa"/>
+            <w:tcBorders>
+              <w:top w:val="single" w:sz="4" w:space="0" w:color="000000"/>
+              <w:left w:val="single" w:sz="4" w:space="0" w:color="000000"/>
+              <w:bottom w:val="single" w:sz="4" w:space="0" w:color="000000"/>
+              <w:right w:val="single" w:sz="4" w:space="0" w:color="000000"/>
+            </w:tcBorders>
+          </w:tcPr>
+          <w:p>
+            <w:r>
+              <w:t>Criação de conta conforme o perfil de quem cadastra</w:t>
+            </w:r>
+          </w:p>
+        </w:tc>
+      </w:tr>
+      <w:tr>
+        <w:tc>
+          <w:tcPr>
+            <w:tcW w:w="2381" w:type="dxa"/>
+            <w:tcBorders>
+              <w:top w:val="single" w:sz="4" w:space="0" w:color="000000"/>
+              <w:left w:val="single" w:sz="4" w:space="0" w:color="000000"/>
+              <w:bottom w:val="single" w:sz="4" w:space="0" w:color="000000"/>
+              <w:right w:val="single" w:sz="4" w:space="0" w:color="000000"/>
+            </w:tcBorders>
+          </w:tcPr>
+          <w:p>
+            <w:r>
+              <w:t>Ator(es) envolvido(s):</w:t>
+            </w:r>
+          </w:p>
+        </w:tc>
+        <w:tc>
+          <w:tcPr>
+            <w:tcW w:w="6641" w:type="dxa"/>
+            <w:tcBorders>
+              <w:top w:val="single" w:sz="4" w:space="0" w:color="000000"/>
+              <w:left w:val="single" w:sz="4" w:space="0" w:color="000000"/>
+              <w:bottom w:val="single" w:sz="4" w:space="0" w:color="000000"/>
+              <w:right w:val="single" w:sz="4" w:space="0" w:color="000000"/>
+            </w:tcBorders>
+          </w:tcPr>
+          <w:p>
+            <w:r>
+              <w:t>Super Administrador; Administrador do município</w:t>
+            </w:r>
+          </w:p>
+        </w:tc>
+      </w:tr>
+      <w:tr>
+        <w:tc>
+          <w:tcPr>
+            <w:tcW w:w="2381" w:type="dxa"/>
+            <w:tcBorders>
+              <w:top w:val="single" w:sz="4" w:space="0" w:color="000000"/>
+              <w:left w:val="single" w:sz="4" w:space="0" w:color="000000"/>
+              <w:bottom w:val="single" w:sz="4" w:space="0" w:color="000000"/>
+              <w:right w:val="single" w:sz="4" w:space="0" w:color="000000"/>
+            </w:tcBorders>
+          </w:tcPr>
+          <w:p>
+            <w:r>
+              <w:t>Pré-condição:</w:t>
+            </w:r>
+          </w:p>
+        </w:tc>
+        <w:tc>
+          <w:tcPr>
+            <w:tcW w:w="6641" w:type="dxa"/>
+            <w:tcBorders>
+              <w:top w:val="single" w:sz="4" w:space="0" w:color="000000"/>
+              <w:left w:val="single" w:sz="4" w:space="0" w:color="000000"/>
+              <w:bottom w:val="single" w:sz="4" w:space="0" w:color="000000"/>
+              <w:right w:val="single" w:sz="4" w:space="0" w:color="000000"/>
+            </w:tcBorders>
+          </w:tcPr>
+          <w:p>
+            <w:r>
+              <w:t>O solicitante está autenticado com o perfil SUPER_ADMIN ou ADMINISTRATOR.</w:t>
+            </w:r>
+          </w:p>
+        </w:tc>
+      </w:tr>
+      <w:tr>
+        <w:tc>
+          <w:tcPr>
+            <w:tcW w:w="2381" w:type="dxa"/>
+            <w:tcBorders>
+              <w:top w:val="single" w:sz="4" w:space="0" w:color="000000"/>
+              <w:left w:val="single" w:sz="4" w:space="0" w:color="000000"/>
+              <w:bottom w:val="single" w:sz="4" w:space="0" w:color="000000"/>
+              <w:right w:val="single" w:sz="4" w:space="0" w:color="000000"/>
+            </w:tcBorders>
+          </w:tcPr>
+          <w:p>
+            <w:r>
+              <w:t>Pós-condição:</w:t>
+            </w:r>
+          </w:p>
+        </w:tc>
+        <w:tc>
+          <w:tcPr>
+            <w:tcW w:w="6641" w:type="dxa"/>
+            <w:tcBorders>
+              <w:top w:val="single" w:sz="4" w:space="0" w:color="000000"/>
+              <w:left w:val="single" w:sz="4" w:space="0" w:color="000000"/>
+              <w:bottom w:val="single" w:sz="4" w:space="0" w:color="000000"/>
+              <w:right w:val="single" w:sz="4" w:space="0" w:color="000000"/>
+            </w:tcBorders>
+          </w:tcPr>
+          <w:p>
+            <w:r>
+              <w:t>Conta criada com o perfil e o município correspondentes, com segundo fator exigido no primeiro acesso.</w:t>
+            </w:r>
+          </w:p>
+        </w:tc>
+      </w:tr>
+      <w:tr>
+        <w:tc>
+          <w:tcPr>
+            <w:tcW w:w="2381" w:type="dxa"/>
+            <w:tcBorders>
+              <w:top w:val="single" w:sz="4" w:space="0" w:color="000000"/>
+              <w:left w:val="single" w:sz="4" w:space="0" w:color="000000"/>
+              <w:bottom w:val="single" w:sz="4" w:space="0" w:color="000000"/>
+              <w:right w:val="single" w:sz="4" w:space="0" w:color="000000"/>
+            </w:tcBorders>
+          </w:tcPr>
+          <w:p>
+            <w:r>
+              <w:t>Ator</w:t>
+            </w:r>
+          </w:p>
+        </w:tc>
+        <w:tc>
+          <w:tcPr>
+            <w:tcW w:w="6641" w:type="dxa"/>
+            <w:tcBorders>
+              <w:top w:val="single" w:sz="4" w:space="0" w:color="000000"/>
+              <w:left w:val="single" w:sz="4" w:space="0" w:color="000000"/>
+              <w:bottom w:val="single" w:sz="4" w:space="0" w:color="000000"/>
+              <w:right w:val="single" w:sz="4" w:space="0" w:color="000000"/>
+            </w:tcBorders>
+          </w:tcPr>
+          <w:p>
+            <w:r>
+              <w:t>Sistema</w:t>
+            </w:r>
+          </w:p>
+        </w:tc>
+      </w:tr>
+      <w:tr>
+        <w:tc>
+          <w:tcPr>
+            <w:tcW w:w="2381" w:type="dxa"/>
+            <w:tcBorders>
+              <w:top w:val="single" w:sz="4" w:space="0" w:color="000000"/>
+              <w:left w:val="single" w:sz="4" w:space="0" w:color="000000"/>
+              <w:bottom w:val="single" w:sz="4" w:space="0" w:color="000000"/>
+              <w:right w:val="single" w:sz="4" w:space="0" w:color="000000"/>
+            </w:tcBorders>
+          </w:tcPr>
+          <w:p>
+            <w:r>
+              <w:t>1. O solicitante acessa “Criar Usuário”.</w:t>
+            </w:r>
+          </w:p>
+        </w:tc>
+        <w:tc>
+          <w:tcPr>
+            <w:tcW w:w="6641" w:type="dxa"/>
+            <w:tcBorders>
+              <w:top w:val="single" w:sz="4" w:space="0" w:color="000000"/>
+              <w:left w:val="single" w:sz="4" w:space="0" w:color="000000"/>
+              <w:bottom w:val="single" w:sz="4" w:space="0" w:color="000000"/>
+              <w:right w:val="single" w:sz="4" w:space="0" w:color="000000"/>
+            </w:tcBorders>
+          </w:tcPr>
+          <w:p>
+            <w:r/>
+          </w:p>
+        </w:tc>
+      </w:tr>
+      <w:tr>
+        <w:tc>
+          <w:tcPr>
+            <w:tcW w:w="2381" w:type="dxa"/>
+            <w:tcBorders>
+              <w:top w:val="single" w:sz="4" w:space="0" w:color="000000"/>
+              <w:left w:val="single" w:sz="4" w:space="0" w:color="000000"/>
+              <w:bottom w:val="single" w:sz="4" w:space="0" w:color="000000"/>
+              <w:right w:val="single" w:sz="4" w:space="0" w:color="000000"/>
+            </w:tcBorders>
+          </w:tcPr>
+          <w:p>
+            <w:r/>
+          </w:p>
+        </w:tc>
+        <w:tc>
+          <w:tcPr>
+            <w:tcW w:w="6641" w:type="dxa"/>
+            <w:tcBorders>
+              <w:top w:val="single" w:sz="4" w:space="0" w:color="000000"/>
+              <w:left w:val="single" w:sz="4" w:space="0" w:color="000000"/>
+              <w:bottom w:val="single" w:sz="4" w:space="0" w:color="000000"/>
+              <w:right w:val="single" w:sz="4" w:space="0" w:color="000000"/>
+            </w:tcBorders>
+          </w:tcPr>
+          <w:p>
+            <w:r>
+              <w:t>2. O sistema apresenta os perfis que o solicitante pode criar: ao Super Administrador, funcionário, administrador do município e Super Administrador; ao administrador municipal, apenas funcionário, com o município preenchido e bloqueado.</w:t>
+            </w:r>
+          </w:p>
+        </w:tc>
+      </w:tr>
+      <w:tr>
+        <w:tc>
+          <w:tcPr>
+            <w:tcW w:w="2381" w:type="dxa"/>
+            <w:tcBorders>
+              <w:top w:val="single" w:sz="4" w:space="0" w:color="000000"/>
+              <w:left w:val="single" w:sz="4" w:space="0" w:color="000000"/>
+              <w:bottom w:val="single" w:sz="4" w:space="0" w:color="000000"/>
+              <w:right w:val="single" w:sz="4" w:space="0" w:color="000000"/>
+            </w:tcBorders>
+          </w:tcPr>
+          <w:p>
+            <w:r>
+              <w:t>3. O solicitante informa nome, endereço de correio eletrônico, senha inicial, perfil e, quando couber, a unidade federativa e o município.</w:t>
+            </w:r>
+          </w:p>
+        </w:tc>
+        <w:tc>
+          <w:tcPr>
+            <w:tcW w:w="6641" w:type="dxa"/>
+            <w:tcBorders>
+              <w:top w:val="single" w:sz="4" w:space="0" w:color="000000"/>
+              <w:left w:val="single" w:sz="4" w:space="0" w:color="000000"/>
+              <w:bottom w:val="single" w:sz="4" w:space="0" w:color="000000"/>
+              <w:right w:val="single" w:sz="4" w:space="0" w:color="000000"/>
+            </w:tcBorders>
+          </w:tcPr>
+          <w:p>
+            <w:r/>
+          </w:p>
+        </w:tc>
+      </w:tr>
+      <w:tr>
+        <w:tc>
+          <w:tcPr>
+            <w:tcW w:w="2381" w:type="dxa"/>
+            <w:tcBorders>
+              <w:top w:val="single" w:sz="4" w:space="0" w:color="000000"/>
+              <w:left w:val="single" w:sz="4" w:space="0" w:color="000000"/>
+              <w:bottom w:val="single" w:sz="4" w:space="0" w:color="000000"/>
+              <w:right w:val="single" w:sz="4" w:space="0" w:color="000000"/>
+            </w:tcBorders>
+          </w:tcPr>
+          <w:p>
+            <w:r/>
+          </w:p>
+        </w:tc>
+        <w:tc>
+          <w:tcPr>
+            <w:tcW w:w="6641" w:type="dxa"/>
+            <w:tcBorders>
+              <w:top w:val="single" w:sz="4" w:space="0" w:color="000000"/>
+              <w:left w:val="single" w:sz="4" w:space="0" w:color="000000"/>
+              <w:bottom w:val="single" w:sz="4" w:space="0" w:color="000000"/>
+              <w:right w:val="single" w:sz="4" w:space="0" w:color="000000"/>
+            </w:tcBorders>
+          </w:tcPr>
+          <w:p>
+            <w:r>
+              <w:t>4. O sistema valida os dados, cria a conta e expede mensagem de boas-vindas com a orientação de configurar o segundo fator no primeiro acesso.</w:t>
+            </w:r>
+          </w:p>
+        </w:tc>
+      </w:tr>
+      <w:tr>
+        <w:tc>
+          <w:tcPr>
+            <w:tcW w:w="2381" w:type="dxa"/>
+            <w:tcBorders>
+              <w:top w:val="single" w:sz="4" w:space="0" w:color="000000"/>
+              <w:left w:val="single" w:sz="4" w:space="0" w:color="000000"/>
+              <w:bottom w:val="single" w:sz="4" w:space="0" w:color="000000"/>
+              <w:right w:val="single" w:sz="4" w:space="0" w:color="000000"/>
+            </w:tcBorders>
+          </w:tcPr>
+          <w:p>
+            <w:r/>
+          </w:p>
+        </w:tc>
+        <w:tc>
+          <w:tcPr>
+            <w:tcW w:w="6641" w:type="dxa"/>
+            <w:tcBorders>
+              <w:top w:val="single" w:sz="4" w:space="0" w:color="000000"/>
+              <w:left w:val="single" w:sz="4" w:space="0" w:color="000000"/>
+              <w:bottom w:val="single" w:sz="4" w:space="0" w:color="000000"/>
+              <w:right w:val="single" w:sz="4" w:space="0" w:color="000000"/>
+            </w:tcBorders>
+          </w:tcPr>
+          <w:p>
+            <w:r>
+              <w:t>5. Fluxo alternativo — perfil de administrador solicitado por administrador municipal: o sistema recusa a operação, privativa do Super Administrador.</w:t>
+            </w:r>
+          </w:p>
+        </w:tc>
+      </w:tr>
+      <w:tr>
+        <w:tc>
+          <w:tcPr>
+            <w:tcW w:w="2381" w:type="dxa"/>
+            <w:tcBorders>
+              <w:top w:val="single" w:sz="4" w:space="0" w:color="000000"/>
+              <w:left w:val="single" w:sz="4" w:space="0" w:color="000000"/>
+              <w:bottom w:val="single" w:sz="4" w:space="0" w:color="000000"/>
+              <w:right w:val="single" w:sz="4" w:space="0" w:color="000000"/>
+            </w:tcBorders>
+          </w:tcPr>
+          <w:p>
+            <w:r/>
+          </w:p>
+        </w:tc>
+        <w:tc>
+          <w:tcPr>
+            <w:tcW w:w="6641" w:type="dxa"/>
+            <w:tcBorders>
+              <w:top w:val="single" w:sz="4" w:space="0" w:color="000000"/>
+              <w:left w:val="single" w:sz="4" w:space="0" w:color="000000"/>
+              <w:bottom w:val="single" w:sz="4" w:space="0" w:color="000000"/>
+              <w:right w:val="single" w:sz="4" w:space="0" w:color="000000"/>
+            </w:tcBorders>
+          </w:tcPr>
+          <w:p>
+            <w:r>
+              <w:t>6. Fluxo alternativo — município diverso do solicitante: o sistema recusa a operação.</w:t>
+            </w:r>
+          </w:p>
+        </w:tc>
+      </w:tr>
+      <w:tr>
+        <w:tc>
+          <w:tcPr>
+            <w:tcW w:w="2381" w:type="dxa"/>
+            <w:tcBorders>
+              <w:top w:val="single" w:sz="4" w:space="0" w:color="000000"/>
+              <w:left w:val="single" w:sz="4" w:space="0" w:color="000000"/>
+              <w:bottom w:val="single" w:sz="4" w:space="0" w:color="000000"/>
+              <w:right w:val="single" w:sz="4" w:space="0" w:color="000000"/>
+            </w:tcBorders>
+          </w:tcPr>
+          <w:p>
+            <w:r/>
+          </w:p>
+        </w:tc>
+        <w:tc>
+          <w:tcPr>
+            <w:tcW w:w="6641" w:type="dxa"/>
+            <w:tcBorders>
+              <w:top w:val="single" w:sz="4" w:space="0" w:color="000000"/>
+              <w:left w:val="single" w:sz="4" w:space="0" w:color="000000"/>
+              <w:bottom w:val="single" w:sz="4" w:space="0" w:color="000000"/>
+              <w:right w:val="single" w:sz="4" w:space="0" w:color="000000"/>
+            </w:tcBorders>
+          </w:tcPr>
+          <w:p>
+            <w:r>
+              <w:t>7. Fluxo alternativo — endereço de correio eletrônico já cadastrado: o sistema informa a duplicidade e mantém a conta existente.</w:t>
+            </w:r>
+          </w:p>
+        </w:tc>
+      </w:tr>
+    </w:tbl>
+    <w:p>
+      <w:r>
+        <w:rPr>
+          <w:sz w:val="18"/>
+        </w:rPr>
+        <w:t>QUADRO 6 – Fluxo de eventos do cenário “Criação de conta conforme o perfil de quem cadastra”</w:t>
+      </w:r>
+    </w:p>
+    <w:p/>
+    <w:tbl>
+      <w:tblPr>
+        <w:tblStyle w:val="aff"/>
+        <w:tblW w:w="9022" w:type="dxa"/>
+        <w:tblInd w:w="-5" w:type="dxa"/>
+        <w:tblBorders>
+          <w:top w:val="single" w:sz="4" w:space="0" w:color="000000"/>
+          <w:left w:val="single" w:sz="4" w:space="0" w:color="000000"/>
+          <w:bottom w:val="single" w:sz="4" w:space="0" w:color="000000"/>
+          <w:right w:val="single" w:sz="4" w:space="0" w:color="000000"/>
+          <w:insideH w:val="single" w:sz="4" w:space="0" w:color="000000"/>
+          <w:insideV w:val="single" w:sz="4" w:space="0" w:color="000000"/>
+        </w:tblBorders>
+        <w:tblLayout w:type="fixed"/>
+        <w:tblLook w:val="0400" w:firstRow="0" w:lastRow="0" w:firstColumn="0" w:lastColumn="0" w:noHBand="0" w:noVBand="1"/>
+      </w:tblPr>
+      <w:tblGrid>
+        <w:gridCol w:w="2381"/>
+        <w:gridCol w:w="6641"/>
+      </w:tblGrid>
+      <w:tr>
+        <w:tc>
+          <w:tcPr>
+            <w:tcW w:w="2381" w:type="dxa"/>
+            <w:tcBorders>
+              <w:top w:val="single" w:sz="4" w:space="0" w:color="000000"/>
+              <w:left w:val="single" w:sz="4" w:space="0" w:color="000000"/>
+              <w:bottom w:val="single" w:sz="4" w:space="0" w:color="000000"/>
+              <w:right w:val="single" w:sz="4" w:space="0" w:color="000000"/>
+            </w:tcBorders>
+          </w:tcPr>
+          <w:p>
+            <w:r>
+              <w:t>Nome do caso de uso:</w:t>
+            </w:r>
+          </w:p>
+        </w:tc>
+        <w:tc>
+          <w:tcPr>
+            <w:tcW w:w="6641" w:type="dxa"/>
+            <w:tcBorders>
+              <w:top w:val="single" w:sz="4" w:space="0" w:color="000000"/>
+              <w:left w:val="single" w:sz="4" w:space="0" w:color="000000"/>
+              <w:bottom w:val="single" w:sz="4" w:space="0" w:color="000000"/>
+              <w:right w:val="single" w:sz="4" w:space="0" w:color="000000"/>
+            </w:tcBorders>
+          </w:tcPr>
+          <w:p>
+            <w:r>
+              <w:t>Consultar e inativar contas</w:t>
+            </w:r>
+          </w:p>
+        </w:tc>
+      </w:tr>
+      <w:tr>
+        <w:tc>
+          <w:tcPr>
+            <w:tcW w:w="2381" w:type="dxa"/>
+            <w:tcBorders>
+              <w:top w:val="single" w:sz="4" w:space="0" w:color="000000"/>
+              <w:left w:val="single" w:sz="4" w:space="0" w:color="000000"/>
+              <w:bottom w:val="single" w:sz="4" w:space="0" w:color="000000"/>
+              <w:right w:val="single" w:sz="4" w:space="0" w:color="000000"/>
+            </w:tcBorders>
+          </w:tcPr>
+          <w:p>
+            <w:r>
+              <w:t>Nome do cenário:</w:t>
+            </w:r>
+          </w:p>
+        </w:tc>
+        <w:tc>
+          <w:tcPr>
+            <w:tcW w:w="6641" w:type="dxa"/>
+            <w:tcBorders>
+              <w:top w:val="single" w:sz="4" w:space="0" w:color="000000"/>
+              <w:left w:val="single" w:sz="4" w:space="0" w:color="000000"/>
+              <w:bottom w:val="single" w:sz="4" w:space="0" w:color="000000"/>
+              <w:right w:val="single" w:sz="4" w:space="0" w:color="000000"/>
+            </w:tcBorders>
+          </w:tcPr>
+          <w:p>
+            <w:r>
+              <w:t>Manutenção das contas dentro do alcance do solicitante</w:t>
+            </w:r>
+          </w:p>
+        </w:tc>
+      </w:tr>
+      <w:tr>
+        <w:tc>
+          <w:tcPr>
+            <w:tcW w:w="2381" w:type="dxa"/>
+            <w:tcBorders>
+              <w:top w:val="single" w:sz="4" w:space="0" w:color="000000"/>
+              <w:left w:val="single" w:sz="4" w:space="0" w:color="000000"/>
+              <w:bottom w:val="single" w:sz="4" w:space="0" w:color="000000"/>
+              <w:right w:val="single" w:sz="4" w:space="0" w:color="000000"/>
+            </w:tcBorders>
+          </w:tcPr>
+          <w:p>
+            <w:r>
+              <w:t>Ator(es) envolvido(s):</w:t>
+            </w:r>
+          </w:p>
+        </w:tc>
+        <w:tc>
+          <w:tcPr>
+            <w:tcW w:w="6641" w:type="dxa"/>
+            <w:tcBorders>
+              <w:top w:val="single" w:sz="4" w:space="0" w:color="000000"/>
+              <w:left w:val="single" w:sz="4" w:space="0" w:color="000000"/>
+              <w:bottom w:val="single" w:sz="4" w:space="0" w:color="000000"/>
+              <w:right w:val="single" w:sz="4" w:space="0" w:color="000000"/>
+            </w:tcBorders>
+          </w:tcPr>
+          <w:p>
+            <w:r>
+              <w:t>Super Administrador; Administrador do município</w:t>
+            </w:r>
+          </w:p>
+        </w:tc>
+      </w:tr>
+      <w:tr>
+        <w:tc>
+          <w:tcPr>
+            <w:tcW w:w="2381" w:type="dxa"/>
+            <w:tcBorders>
+              <w:top w:val="single" w:sz="4" w:space="0" w:color="000000"/>
+              <w:left w:val="single" w:sz="4" w:space="0" w:color="000000"/>
+              <w:bottom w:val="single" w:sz="4" w:space="0" w:color="000000"/>
+              <w:right w:val="single" w:sz="4" w:space="0" w:color="000000"/>
+            </w:tcBorders>
+          </w:tcPr>
+          <w:p>
+            <w:r>
+              <w:t>Pré-condição:</w:t>
+            </w:r>
+          </w:p>
+        </w:tc>
+        <w:tc>
+          <w:tcPr>
+            <w:tcW w:w="6641" w:type="dxa"/>
+            <w:tcBorders>
+              <w:top w:val="single" w:sz="4" w:space="0" w:color="000000"/>
+              <w:left w:val="single" w:sz="4" w:space="0" w:color="000000"/>
+              <w:bottom w:val="single" w:sz="4" w:space="0" w:color="000000"/>
+              <w:right w:val="single" w:sz="4" w:space="0" w:color="000000"/>
+            </w:tcBorders>
+          </w:tcPr>
+          <w:p>
+            <w:r>
+              <w:t>O solicitante está autenticado com o perfil SUPER_ADMIN ou ADMINISTRATOR.</w:t>
+            </w:r>
+          </w:p>
+        </w:tc>
+      </w:tr>
+      <w:tr>
+        <w:tc>
+          <w:tcPr>
+            <w:tcW w:w="2381" w:type="dxa"/>
+            <w:tcBorders>
+              <w:top w:val="single" w:sz="4" w:space="0" w:color="000000"/>
+              <w:left w:val="single" w:sz="4" w:space="0" w:color="000000"/>
+              <w:bottom w:val="single" w:sz="4" w:space="0" w:color="000000"/>
+              <w:right w:val="single" w:sz="4" w:space="0" w:color="000000"/>
+            </w:tcBorders>
+          </w:tcPr>
+          <w:p>
+            <w:r>
+              <w:t>Pós-condição:</w:t>
+            </w:r>
+          </w:p>
+        </w:tc>
+        <w:tc>
+          <w:tcPr>
+            <w:tcW w:w="6641" w:type="dxa"/>
+            <w:tcBorders>
+              <w:top w:val="single" w:sz="4" w:space="0" w:color="000000"/>
+              <w:left w:val="single" w:sz="4" w:space="0" w:color="000000"/>
+              <w:bottom w:val="single" w:sz="4" w:space="0" w:color="000000"/>
+              <w:right w:val="single" w:sz="4" w:space="0" w:color="000000"/>
+            </w:tcBorders>
+          </w:tcPr>
+          <w:p>
+            <w:r>
+              <w:t>Situação da conta alterada, preservados os dados e o histórico.</w:t>
+            </w:r>
+          </w:p>
+        </w:tc>
+      </w:tr>
+      <w:tr>
+        <w:tc>
+          <w:tcPr>
+            <w:tcW w:w="2381" w:type="dxa"/>
+            <w:tcBorders>
+              <w:top w:val="single" w:sz="4" w:space="0" w:color="000000"/>
+              <w:left w:val="single" w:sz="4" w:space="0" w:color="000000"/>
+              <w:bottom w:val="single" w:sz="4" w:space="0" w:color="000000"/>
+              <w:right w:val="single" w:sz="4" w:space="0" w:color="000000"/>
+            </w:tcBorders>
+          </w:tcPr>
+          <w:p>
+            <w:r>
+              <w:t>Ator</w:t>
+            </w:r>
+          </w:p>
+        </w:tc>
+        <w:tc>
+          <w:tcPr>
+            <w:tcW w:w="6641" w:type="dxa"/>
+            <w:tcBorders>
+              <w:top w:val="single" w:sz="4" w:space="0" w:color="000000"/>
+              <w:left w:val="single" w:sz="4" w:space="0" w:color="000000"/>
+              <w:bottom w:val="single" w:sz="4" w:space="0" w:color="000000"/>
+              <w:right w:val="single" w:sz="4" w:space="0" w:color="000000"/>
+            </w:tcBorders>
+          </w:tcPr>
+          <w:p>
+            <w:r>
+              <w:t>Sistema</w:t>
+            </w:r>
+          </w:p>
+        </w:tc>
+      </w:tr>
+      <w:tr>
+        <w:tc>
+          <w:tcPr>
+            <w:tcW w:w="2381" w:type="dxa"/>
+            <w:tcBorders>
+              <w:top w:val="single" w:sz="4" w:space="0" w:color="000000"/>
+              <w:left w:val="single" w:sz="4" w:space="0" w:color="000000"/>
+              <w:bottom w:val="single" w:sz="4" w:space="0" w:color="000000"/>
+              <w:right w:val="single" w:sz="4" w:space="0" w:color="000000"/>
+            </w:tcBorders>
+          </w:tcPr>
+          <w:p>
+            <w:r>
+              <w:t>1. O solicitante acessa a relação de usuários.</w:t>
+            </w:r>
+          </w:p>
+        </w:tc>
+        <w:tc>
+          <w:tcPr>
+            <w:tcW w:w="6641" w:type="dxa"/>
+            <w:tcBorders>
+              <w:top w:val="single" w:sz="4" w:space="0" w:color="000000"/>
+              <w:left w:val="single" w:sz="4" w:space="0" w:color="000000"/>
+              <w:bottom w:val="single" w:sz="4" w:space="0" w:color="000000"/>
+              <w:right w:val="single" w:sz="4" w:space="0" w:color="000000"/>
+            </w:tcBorders>
+          </w:tcPr>
+          <w:p>
+            <w:r/>
+          </w:p>
+        </w:tc>
+      </w:tr>
+      <w:tr>
+        <w:tc>
+          <w:tcPr>
+            <w:tcW w:w="2381" w:type="dxa"/>
+            <w:tcBorders>
+              <w:top w:val="single" w:sz="4" w:space="0" w:color="000000"/>
+              <w:left w:val="single" w:sz="4" w:space="0" w:color="000000"/>
+              <w:bottom w:val="single" w:sz="4" w:space="0" w:color="000000"/>
+              <w:right w:val="single" w:sz="4" w:space="0" w:color="000000"/>
+            </w:tcBorders>
+          </w:tcPr>
+          <w:p>
+            <w:r/>
+          </w:p>
+        </w:tc>
+        <w:tc>
+          <w:tcPr>
+            <w:tcW w:w="6641" w:type="dxa"/>
+            <w:tcBorders>
+              <w:top w:val="single" w:sz="4" w:space="0" w:color="000000"/>
+              <w:left w:val="single" w:sz="4" w:space="0" w:color="000000"/>
+              <w:bottom w:val="single" w:sz="4" w:space="0" w:color="000000"/>
+              <w:right w:val="single" w:sz="4" w:space="0" w:color="000000"/>
+            </w:tcBorders>
+          </w:tcPr>
+          <w:p>
+            <w:r>
+              <w:t>2. O sistema apresenta todas as contas ao Super Administrador e, ao administrador municipal, apenas as vinculadas ao seu município, excluídas as de Super Administrador.</w:t>
+            </w:r>
+          </w:p>
+        </w:tc>
+      </w:tr>
+      <w:tr>
+        <w:tc>
+          <w:tcPr>
+            <w:tcW w:w="2381" w:type="dxa"/>
+            <w:tcBorders>
+              <w:top w:val="single" w:sz="4" w:space="0" w:color="000000"/>
+              <w:left w:val="single" w:sz="4" w:space="0" w:color="000000"/>
+              <w:bottom w:val="single" w:sz="4" w:space="0" w:color="000000"/>
+              <w:right w:val="single" w:sz="4" w:space="0" w:color="000000"/>
+            </w:tcBorders>
+          </w:tcPr>
+          <w:p>
+            <w:r>
+              <w:t>3. O solicitante aciona a ativação ou a inativação de uma conta.</w:t>
+            </w:r>
+          </w:p>
+        </w:tc>
+        <w:tc>
+          <w:tcPr>
+            <w:tcW w:w="6641" w:type="dxa"/>
+            <w:tcBorders>
+              <w:top w:val="single" w:sz="4" w:space="0" w:color="000000"/>
+              <w:left w:val="single" w:sz="4" w:space="0" w:color="000000"/>
+              <w:bottom w:val="single" w:sz="4" w:space="0" w:color="000000"/>
+              <w:right w:val="single" w:sz="4" w:space="0" w:color="000000"/>
+            </w:tcBorders>
+          </w:tcPr>
+          <w:p>
+            <w:r/>
+          </w:p>
+        </w:tc>
+      </w:tr>
+      <w:tr>
+        <w:tc>
+          <w:tcPr>
+            <w:tcW w:w="2381" w:type="dxa"/>
+            <w:tcBorders>
+              <w:top w:val="single" w:sz="4" w:space="0" w:color="000000"/>
+              <w:left w:val="single" w:sz="4" w:space="0" w:color="000000"/>
+              <w:bottom w:val="single" w:sz="4" w:space="0" w:color="000000"/>
+              <w:right w:val="single" w:sz="4" w:space="0" w:color="000000"/>
+            </w:tcBorders>
+          </w:tcPr>
+          <w:p>
+            <w:r/>
+          </w:p>
+        </w:tc>
+        <w:tc>
+          <w:tcPr>
+            <w:tcW w:w="6641" w:type="dxa"/>
+            <w:tcBorders>
+              <w:top w:val="single" w:sz="4" w:space="0" w:color="000000"/>
+              <w:left w:val="single" w:sz="4" w:space="0" w:color="000000"/>
+              <w:bottom w:val="single" w:sz="4" w:space="0" w:color="000000"/>
+              <w:right w:val="single" w:sz="4" w:space="0" w:color="000000"/>
+            </w:tcBorders>
+          </w:tcPr>
+          <w:p>
+            <w:r>
+              <w:t>4. O sistema altera a situação da conta e impede o acesso enquanto ela estiver inativa, sem excluir os dados.</w:t>
+            </w:r>
+          </w:p>
+        </w:tc>
+      </w:tr>
+      <w:tr>
+        <w:tc>
+          <w:tcPr>
+            <w:tcW w:w="2381" w:type="dxa"/>
+            <w:tcBorders>
+              <w:top w:val="single" w:sz="4" w:space="0" w:color="000000"/>
+              <w:left w:val="single" w:sz="4" w:space="0" w:color="000000"/>
+              <w:bottom w:val="single" w:sz="4" w:space="0" w:color="000000"/>
+              <w:right w:val="single" w:sz="4" w:space="0" w:color="000000"/>
+            </w:tcBorders>
+          </w:tcPr>
+          <w:p>
+            <w:r/>
+          </w:p>
+        </w:tc>
+        <w:tc>
+          <w:tcPr>
+            <w:tcW w:w="6641" w:type="dxa"/>
+            <w:tcBorders>
+              <w:top w:val="single" w:sz="4" w:space="0" w:color="000000"/>
+              <w:left w:val="single" w:sz="4" w:space="0" w:color="000000"/>
+              <w:bottom w:val="single" w:sz="4" w:space="0" w:color="000000"/>
+              <w:right w:val="single" w:sz="4" w:space="0" w:color="000000"/>
+            </w:tcBorders>
+          </w:tcPr>
+          <w:p>
+            <w:r>
+              <w:t>5. O sistema mantém a conta recém-inativada visível na relação, mesmo com o filtro “Somente ativas”, para que a exclusão possa ser acionada em seguida; havendo sessão aberta da conta inativada ou excluída, o sistema encerra a sessão aberta da conta: na chamada seguinte ao servidor, em até 30 segundos pela verificação periódica da sessão, a pessoa recebe o aviso “Sessão encerrada — Esta conta foi excluída ou desativada pela administração e a sessão foi desconectada.” e é desconectada.</w:t>
+            </w:r>
+          </w:p>
+        </w:tc>
+      </w:tr>
+      <w:tr>
+        <w:tc>
+          <w:tcPr>
+            <w:tcW w:w="2381" w:type="dxa"/>
+            <w:tcBorders>
+              <w:top w:val="single" w:sz="4" w:space="0" w:color="000000"/>
+              <w:left w:val="single" w:sz="4" w:space="0" w:color="000000"/>
+              <w:bottom w:val="single" w:sz="4" w:space="0" w:color="000000"/>
+              <w:right w:val="single" w:sz="4" w:space="0" w:color="000000"/>
+            </w:tcBorders>
+          </w:tcPr>
+          <w:p>
+            <w:r/>
+          </w:p>
+        </w:tc>
+        <w:tc>
+          <w:tcPr>
+            <w:tcW w:w="6641" w:type="dxa"/>
+            <w:tcBorders>
+              <w:top w:val="single" w:sz="4" w:space="0" w:color="000000"/>
+              <w:left w:val="single" w:sz="4" w:space="0" w:color="000000"/>
+              <w:bottom w:val="single" w:sz="4" w:space="0" w:color="000000"/>
+              <w:right w:val="single" w:sz="4" w:space="0" w:color="000000"/>
+            </w:tcBorders>
+          </w:tcPr>
+          <w:p>
+            <w:r>
+              <w:t>6. Fluxo alternativo — conta fora do alcance do solicitante: o sistema recusa a operação.</w:t>
+            </w:r>
+          </w:p>
+        </w:tc>
+      </w:tr>
+    </w:tbl>
+    <w:p>
+      <w:r>
+        <w:rPr>
+          <w:sz w:val="18"/>
+        </w:rPr>
+        <w:t>QUADRO 7 – Fluxo de eventos do cenário “Manutenção das contas dentro do alcance do solicitante”</w:t>
       </w:r>
     </w:p>
     <w:p/>

</xml_diff>

<commit_message>
docs: acesso do departamento, exclusão em cadeia, visitante com município e agrupamento a 70 m
- Monografia: RF26 (acesso do departamento e solicitação de conclusão) e RN11
  (escopo e validade do acesso); RF08, RF11, RF16, RF21, RF23 a RF25, RN01,
  RN06, RN09 e RNF17 atualizados; occurrence_history com kind e anexo; 396
  testes no back-end e 34 no front-end; linha na tabela de revisões.
- Apêndice C: fluxos de solicitação e confirmação de conclusão, entrada como
  visitante com município; encaminhamento, exclusão, mapa, máscaras e códigos.
- Apêndice D: DDL sincronizado, dicionário de dados e DER com as colunas novas.
- Apêndice I: página e API públicas do departamento e rota no Google Maps.
- Apêndice J: casos CT49 a CT67, CT23 e CT48 revistos, relatório e saídas do
  Surefire da execução de 30/09/2026.
- Apêndice K: seção do funcionário do departamento e demais perfis revistos.
- README: funcionalidades novas e como subir tudo com o subir.sh.
</commit_message>
<xml_diff>
--- a/ApêndiceC-VisãoFuncional/3.FluxosdeEvento/FalaCidade_FluxosDeEventos_ModuloAdministrarConta_v2.docx
+++ b/ApêndiceC-VisãoFuncional/3.FluxosdeEvento/FalaCidade_FluxosDeEventos_ModuloAdministrarConta_v2.docx
@@ -491,7 +491,7 @@
                 <w:b w:val="0"/>
                 <w:sz w:val="20"/>
               </w:rPr>
-              <w:t>4. O sistema valida a unicidade do endereço de correio eletrônico e a política de complexidade da senha inicial.</w:t>
+              <w:t>4. O sistema valida os campos — o nome aceita somente letras, inclusive acentuadas, espaço, apóstrofo, hífen e ponto, recusados os números, com até 150 caracteres; o endereço de correio eletrônico admite até 150 caracteres; a unidade federativa aceita duas letras, convertidas em maiúsculas; e o município admite até 100 caracteres —, a unicidade do endereço de correio eletrônico e a política de complexidade da senha inicial.</w:t>
             </w:r>
           </w:p>
         </w:tc>
@@ -957,136 +957,222 @@
                 <w:b w:val="0"/>
                 <w:sz w:val="20"/>
               </w:rPr>
-              <w:t>2. O sistema valida os campos alterados e impede a alteração do endereço de correio eletrônico para um já cadastrado.</w:t>
-            </w:r>
-          </w:p>
-        </w:tc>
-      </w:tr>
-      <w:tr>
-        <w:tc>
-          <w:tcPr>
-            <w:tcW w:w="2381" w:type="dxa"/>
-            <w:tcBorders>
-              <w:top w:val="single" w:sz="4" w:space="0" w:color="000000"/>
-              <w:left w:val="single" w:sz="4" w:space="0" w:color="000000"/>
-              <w:bottom w:val="single" w:sz="4" w:space="0" w:color="000000"/>
-              <w:right w:val="single" w:sz="4" w:space="0" w:color="000000"/>
-            </w:tcBorders>
-          </w:tcPr>
-          <w:p>
-            <w:r/>
-            <w:r>
-              <w:rPr>
-                <w:b w:val="0"/>
-                <w:sz w:val="20"/>
-              </w:rPr>
-            </w:r>
-          </w:p>
-        </w:tc>
-        <w:tc>
-          <w:tcPr>
-            <w:tcW w:w="6641" w:type="dxa"/>
-            <w:tcBorders>
-              <w:top w:val="single" w:sz="4" w:space="0" w:color="000000"/>
-              <w:left w:val="single" w:sz="4" w:space="0" w:color="000000"/>
-              <w:bottom w:val="single" w:sz="4" w:space="0" w:color="000000"/>
-              <w:right w:val="single" w:sz="4" w:space="0" w:color="000000"/>
-            </w:tcBorders>
-          </w:tcPr>
-          <w:p>
-            <w:r/>
-            <w:r>
-              <w:rPr>
-                <w:b w:val="0"/>
-                <w:sz w:val="20"/>
-              </w:rPr>
-              <w:t>3. O sistema persiste as alterações e atualiza a data de modificação do registro.</w:t>
-            </w:r>
-          </w:p>
-        </w:tc>
-      </w:tr>
-      <w:tr>
-        <w:tc>
-          <w:tcPr>
-            <w:tcW w:w="2381" w:type="dxa"/>
-            <w:tcBorders>
-              <w:top w:val="single" w:sz="4" w:space="0" w:color="000000"/>
-              <w:left w:val="single" w:sz="4" w:space="0" w:color="000000"/>
-              <w:bottom w:val="single" w:sz="4" w:space="0" w:color="000000"/>
-              <w:right w:val="single" w:sz="4" w:space="0" w:color="000000"/>
-            </w:tcBorders>
-          </w:tcPr>
-          <w:p>
-            <w:r/>
-            <w:r>
-              <w:rPr>
-                <w:b w:val="0"/>
-                <w:sz w:val="20"/>
-              </w:rPr>
-            </w:r>
-          </w:p>
-        </w:tc>
-        <w:tc>
-          <w:tcPr>
-            <w:tcW w:w="6641" w:type="dxa"/>
-            <w:tcBorders>
-              <w:top w:val="single" w:sz="4" w:space="0" w:color="000000"/>
-              <w:left w:val="single" w:sz="4" w:space="0" w:color="000000"/>
-              <w:bottom w:val="single" w:sz="4" w:space="0" w:color="000000"/>
-              <w:right w:val="single" w:sz="4" w:space="0" w:color="000000"/>
-            </w:tcBorders>
-          </w:tcPr>
-          <w:p>
-            <w:r/>
-            <w:r>
-              <w:rPr>
-                <w:b w:val="0"/>
-                <w:sz w:val="20"/>
-              </w:rPr>
-              <w:t>4. O sistema apresenta a confirmação da atualização.</w:t>
-            </w:r>
-          </w:p>
-        </w:tc>
-      </w:tr>
-      <w:tr>
-        <w:tc>
-          <w:tcPr>
-            <w:tcW w:w="2381" w:type="dxa"/>
-            <w:tcBorders>
-              <w:top w:val="single" w:sz="4" w:space="0" w:color="000000"/>
-              <w:left w:val="single" w:sz="4" w:space="0" w:color="000000"/>
-              <w:bottom w:val="single" w:sz="4" w:space="0" w:color="000000"/>
-              <w:right w:val="single" w:sz="4" w:space="0" w:color="000000"/>
-            </w:tcBorders>
-          </w:tcPr>
-          <w:p>
-            <w:r/>
-            <w:r>
-              <w:rPr>
-                <w:b w:val="0"/>
-                <w:sz w:val="20"/>
-              </w:rPr>
-            </w:r>
-          </w:p>
-        </w:tc>
-        <w:tc>
-          <w:tcPr>
-            <w:tcW w:w="6641" w:type="dxa"/>
-            <w:tcBorders>
-              <w:top w:val="single" w:sz="4" w:space="0" w:color="000000"/>
-              <w:left w:val="single" w:sz="4" w:space="0" w:color="000000"/>
-              <w:bottom w:val="single" w:sz="4" w:space="0" w:color="000000"/>
-              <w:right w:val="single" w:sz="4" w:space="0" w:color="000000"/>
-            </w:tcBorders>
-          </w:tcPr>
-          <w:p>
-            <w:r/>
-            <w:r>
-              <w:rPr>
-                <w:b w:val="0"/>
-                <w:sz w:val="20"/>
-              </w:rPr>
-              <w:t>5. Fluxo alternativo — telefone já cadastrado em outra conta: o sistema recusa a alteração com HTTP 409 e a mensagem “Este celular já está cadastrado em outra conta.”, preservados os dados anteriores.</w:t>
+              <w:t>2. O sistema aplica as máscaras durante a digitação: o telefone aceita somente números e recebe automaticamente os parênteses do DDD e o hífen — (35) 99999-8888 —, ignorado o prefixo +55 colado; o CEP aceita no máximo oito números e recebe o hífen automaticamente — 37540-000 —; e a unidade federativa aceita duas letras, convertidas em maiúsculas.</w:t>
+            </w:r>
+          </w:p>
+        </w:tc>
+      </w:tr>
+      <w:tr>
+        <w:tc>
+          <w:tcPr>
+            <w:tcW w:w="2381" w:type="dxa"/>
+            <w:tcBorders>
+              <w:top w:val="single" w:sz="4" w:space="0" w:color="000000"/>
+              <w:left w:val="single" w:sz="4" w:space="0" w:color="000000"/>
+              <w:bottom w:val="single" w:sz="4" w:space="0" w:color="000000"/>
+              <w:right w:val="single" w:sz="4" w:space="0" w:color="000000"/>
+            </w:tcBorders>
+          </w:tcPr>
+          <w:p>
+            <w:r/>
+            <w:r>
+              <w:rPr>
+                <w:b w:val="0"/>
+                <w:sz w:val="20"/>
+              </w:rPr>
+            </w:r>
+          </w:p>
+        </w:tc>
+        <w:tc>
+          <w:tcPr>
+            <w:tcW w:w="6641" w:type="dxa"/>
+            <w:tcBorders>
+              <w:top w:val="single" w:sz="4" w:space="0" w:color="000000"/>
+              <w:left w:val="single" w:sz="4" w:space="0" w:color="000000"/>
+              <w:bottom w:val="single" w:sz="4" w:space="0" w:color="000000"/>
+              <w:right w:val="single" w:sz="4" w:space="0" w:color="000000"/>
+            </w:tcBorders>
+          </w:tcPr>
+          <w:p>
+            <w:r/>
+            <w:r>
+              <w:rPr>
+                <w:b w:val="0"/>
+                <w:sz w:val="20"/>
+              </w:rPr>
+              <w:t>3. O sistema valida os campos alterados — o nome aceita somente letras, inclusive acentuadas, espaço, apóstrofo, hífen e ponto, recusados os números, com até 150 caracteres; o telefone, quando informado, deve ser celular completo, com DDD sem zero e iniciado pelo dígito 9; o CEP, quando informado, deve estar completo; o logradouro admite até 200 caracteres, o bairro e o município até 100 e o número até 10 — e impede a alteração do endereço de correio eletrônico para um já cadastrado.</w:t>
+            </w:r>
+          </w:p>
+        </w:tc>
+      </w:tr>
+      <w:tr>
+        <w:tc>
+          <w:tcPr>
+            <w:tcW w:w="2381" w:type="dxa"/>
+            <w:tcBorders>
+              <w:top w:val="single" w:sz="4" w:space="0" w:color="000000"/>
+              <w:left w:val="single" w:sz="4" w:space="0" w:color="000000"/>
+              <w:bottom w:val="single" w:sz="4" w:space="0" w:color="000000"/>
+              <w:right w:val="single" w:sz="4" w:space="0" w:color="000000"/>
+            </w:tcBorders>
+          </w:tcPr>
+          <w:p>
+            <w:r/>
+            <w:r>
+              <w:rPr>
+                <w:b w:val="0"/>
+                <w:sz w:val="20"/>
+              </w:rPr>
+            </w:r>
+          </w:p>
+        </w:tc>
+        <w:tc>
+          <w:tcPr>
+            <w:tcW w:w="6641" w:type="dxa"/>
+            <w:tcBorders>
+              <w:top w:val="single" w:sz="4" w:space="0" w:color="000000"/>
+              <w:left w:val="single" w:sz="4" w:space="0" w:color="000000"/>
+              <w:bottom w:val="single" w:sz="4" w:space="0" w:color="000000"/>
+              <w:right w:val="single" w:sz="4" w:space="0" w:color="000000"/>
+            </w:tcBorders>
+          </w:tcPr>
+          <w:p>
+            <w:r/>
+            <w:r>
+              <w:rPr>
+                <w:b w:val="0"/>
+                <w:sz w:val="20"/>
+              </w:rPr>
+              <w:t>4. O sistema persiste as alterações e atualiza a data de modificação do registro.</w:t>
+            </w:r>
+          </w:p>
+        </w:tc>
+      </w:tr>
+      <w:tr>
+        <w:tc>
+          <w:tcPr>
+            <w:tcW w:w="2381" w:type="dxa"/>
+            <w:tcBorders>
+              <w:top w:val="single" w:sz="4" w:space="0" w:color="000000"/>
+              <w:left w:val="single" w:sz="4" w:space="0" w:color="000000"/>
+              <w:bottom w:val="single" w:sz="4" w:space="0" w:color="000000"/>
+              <w:right w:val="single" w:sz="4" w:space="0" w:color="000000"/>
+            </w:tcBorders>
+          </w:tcPr>
+          <w:p>
+            <w:r/>
+            <w:r>
+              <w:rPr>
+                <w:b w:val="0"/>
+                <w:sz w:val="20"/>
+              </w:rPr>
+            </w:r>
+          </w:p>
+        </w:tc>
+        <w:tc>
+          <w:tcPr>
+            <w:tcW w:w="6641" w:type="dxa"/>
+            <w:tcBorders>
+              <w:top w:val="single" w:sz="4" w:space="0" w:color="000000"/>
+              <w:left w:val="single" w:sz="4" w:space="0" w:color="000000"/>
+              <w:bottom w:val="single" w:sz="4" w:space="0" w:color="000000"/>
+              <w:right w:val="single" w:sz="4" w:space="0" w:color="000000"/>
+            </w:tcBorders>
+          </w:tcPr>
+          <w:p>
+            <w:r/>
+            <w:r>
+              <w:rPr>
+                <w:b w:val="0"/>
+                <w:sz w:val="20"/>
+              </w:rPr>
+              <w:t>5. O sistema apresenta a confirmação da atualização.</w:t>
+            </w:r>
+          </w:p>
+        </w:tc>
+      </w:tr>
+      <w:tr>
+        <w:tc>
+          <w:tcPr>
+            <w:tcW w:w="2381" w:type="dxa"/>
+            <w:tcBorders>
+              <w:top w:val="single" w:sz="4" w:space="0" w:color="000000"/>
+              <w:left w:val="single" w:sz="4" w:space="0" w:color="000000"/>
+              <w:bottom w:val="single" w:sz="4" w:space="0" w:color="000000"/>
+              <w:right w:val="single" w:sz="4" w:space="0" w:color="000000"/>
+            </w:tcBorders>
+          </w:tcPr>
+          <w:p>
+            <w:r/>
+            <w:r>
+              <w:rPr>
+                <w:b w:val="0"/>
+                <w:sz w:val="20"/>
+              </w:rPr>
+            </w:r>
+          </w:p>
+        </w:tc>
+        <w:tc>
+          <w:tcPr>
+            <w:tcW w:w="6641" w:type="dxa"/>
+            <w:tcBorders>
+              <w:top w:val="single" w:sz="4" w:space="0" w:color="000000"/>
+              <w:left w:val="single" w:sz="4" w:space="0" w:color="000000"/>
+              <w:bottom w:val="single" w:sz="4" w:space="0" w:color="000000"/>
+              <w:right w:val="single" w:sz="4" w:space="0" w:color="000000"/>
+            </w:tcBorders>
+          </w:tcPr>
+          <w:p>
+            <w:r/>
+            <w:r>
+              <w:rPr>
+                <w:b w:val="0"/>
+                <w:sz w:val="20"/>
+              </w:rPr>
+              <w:t>6. Fluxo alternativo — campo inválido: o sistema não grava a alteração e apresenta o aviso no próprio campo — “Use só letras no nome”, “Celular completo com DDD: (35) 99999-9999” ou “CEP com 8 números: 37540-000”.</w:t>
+            </w:r>
+          </w:p>
+        </w:tc>
+      </w:tr>
+      <w:tr>
+        <w:tc>
+          <w:tcPr>
+            <w:tcW w:w="2381" w:type="dxa"/>
+            <w:tcBorders>
+              <w:top w:val="single" w:sz="4" w:space="0" w:color="000000"/>
+              <w:left w:val="single" w:sz="4" w:space="0" w:color="000000"/>
+              <w:bottom w:val="single" w:sz="4" w:space="0" w:color="000000"/>
+              <w:right w:val="single" w:sz="4" w:space="0" w:color="000000"/>
+            </w:tcBorders>
+          </w:tcPr>
+          <w:p>
+            <w:r/>
+            <w:r>
+              <w:rPr>
+                <w:b w:val="0"/>
+                <w:sz w:val="20"/>
+              </w:rPr>
+            </w:r>
+          </w:p>
+        </w:tc>
+        <w:tc>
+          <w:tcPr>
+            <w:tcW w:w="6641" w:type="dxa"/>
+            <w:tcBorders>
+              <w:top w:val="single" w:sz="4" w:space="0" w:color="000000"/>
+              <w:left w:val="single" w:sz="4" w:space="0" w:color="000000"/>
+              <w:bottom w:val="single" w:sz="4" w:space="0" w:color="000000"/>
+              <w:right w:val="single" w:sz="4" w:space="0" w:color="000000"/>
+            </w:tcBorders>
+          </w:tcPr>
+          <w:p>
+            <w:r/>
+            <w:r>
+              <w:rPr>
+                <w:b w:val="0"/>
+                <w:sz w:val="20"/>
+              </w:rPr>
+              <w:t>7. Fluxo alternativo — telefone já cadastrado em outra conta: o sistema recusa a alteração com HTTP 409 e a mensagem “Este celular já está cadastrado em outra conta.”, preservados os dados anteriores.</w:t>
             </w:r>
           </w:p>
         </w:tc>
@@ -1466,7 +1552,7 @@
                 <w:b w:val="0"/>
                 <w:sz w:val="20"/>
               </w:rPr>
-              <w:t>2. O sistema solicita a confirmação do número de celular, preenchido previamente com o telefone do perfil.</w:t>
+              <w:t>2. O sistema solicita a confirmação do número de celular, preenchido previamente com o telefone do perfil, com a máscara (35) 99999-8888 aplicada durante a digitação; o botão “Enviar código” permanece desabilitado enquanto o número não for celular completo, com DDD sem zero e iniciado pelo dígito 9.</w:t>
             </w:r>
           </w:p>
         </w:tc>
@@ -1595,7 +1681,7 @@
                 <w:b w:val="0"/>
                 <w:sz w:val="20"/>
               </w:rPr>
-              <w:t>5. O sistema apresenta o campo do código e o botão “Reenviar código”, liberado após contagem regressiva de 60 segundos.</w:t>
+              <w:t>5. O sistema apresenta o campo do código — preenchido automaticamente quando houver na área de transferência um código de seis dígitos copiado, e identificado como código de uso único, de modo que o teclado do celular sugere o código recebido por SMS — e o botão “Reenviar código”, liberado após contagem regressiva de 60 segundos.</w:t>
             </w:r>
           </w:p>
         </w:tc>
@@ -3275,103 +3361,135 @@
           </w:tcPr>
           <w:p>
             <w:r>
-              <w:t>4. O sistema valida os dados, cria a conta e expede mensagem de boas-vindas com a orientação de configurar o segundo fator no primeiro acesso.</w:t>
-            </w:r>
-          </w:p>
-        </w:tc>
-      </w:tr>
-      <w:tr>
-        <w:tc>
-          <w:tcPr>
-            <w:tcW w:w="2381" w:type="dxa"/>
-            <w:tcBorders>
-              <w:top w:val="single" w:sz="4" w:space="0" w:color="000000"/>
-              <w:left w:val="single" w:sz="4" w:space="0" w:color="000000"/>
-              <w:bottom w:val="single" w:sz="4" w:space="0" w:color="000000"/>
-              <w:right w:val="single" w:sz="4" w:space="0" w:color="000000"/>
-            </w:tcBorders>
-          </w:tcPr>
-          <w:p>
-            <w:r/>
-          </w:p>
-        </w:tc>
-        <w:tc>
-          <w:tcPr>
-            <w:tcW w:w="6641" w:type="dxa"/>
-            <w:tcBorders>
-              <w:top w:val="single" w:sz="4" w:space="0" w:color="000000"/>
-              <w:left w:val="single" w:sz="4" w:space="0" w:color="000000"/>
-              <w:bottom w:val="single" w:sz="4" w:space="0" w:color="000000"/>
-              <w:right w:val="single" w:sz="4" w:space="0" w:color="000000"/>
-            </w:tcBorders>
-          </w:tcPr>
-          <w:p>
-            <w:r>
-              <w:t>5. Fluxo alternativo — perfil de administrador solicitado por administrador municipal: o sistema recusa a operação, privativa do Super Administrador.</w:t>
-            </w:r>
-          </w:p>
-        </w:tc>
-      </w:tr>
-      <w:tr>
-        <w:tc>
-          <w:tcPr>
-            <w:tcW w:w="2381" w:type="dxa"/>
-            <w:tcBorders>
-              <w:top w:val="single" w:sz="4" w:space="0" w:color="000000"/>
-              <w:left w:val="single" w:sz="4" w:space="0" w:color="000000"/>
-              <w:bottom w:val="single" w:sz="4" w:space="0" w:color="000000"/>
-              <w:right w:val="single" w:sz="4" w:space="0" w:color="000000"/>
-            </w:tcBorders>
-          </w:tcPr>
-          <w:p>
-            <w:r/>
-          </w:p>
-        </w:tc>
-        <w:tc>
-          <w:tcPr>
-            <w:tcW w:w="6641" w:type="dxa"/>
-            <w:tcBorders>
-              <w:top w:val="single" w:sz="4" w:space="0" w:color="000000"/>
-              <w:left w:val="single" w:sz="4" w:space="0" w:color="000000"/>
-              <w:bottom w:val="single" w:sz="4" w:space="0" w:color="000000"/>
-              <w:right w:val="single" w:sz="4" w:space="0" w:color="000000"/>
-            </w:tcBorders>
-          </w:tcPr>
-          <w:p>
-            <w:r>
-              <w:t>6. Fluxo alternativo — município diverso do solicitante: o sistema recusa a operação.</w:t>
-            </w:r>
-          </w:p>
-        </w:tc>
-      </w:tr>
-      <w:tr>
-        <w:tc>
-          <w:tcPr>
-            <w:tcW w:w="2381" w:type="dxa"/>
-            <w:tcBorders>
-              <w:top w:val="single" w:sz="4" w:space="0" w:color="000000"/>
-              <w:left w:val="single" w:sz="4" w:space="0" w:color="000000"/>
-              <w:bottom w:val="single" w:sz="4" w:space="0" w:color="000000"/>
-              <w:right w:val="single" w:sz="4" w:space="0" w:color="000000"/>
-            </w:tcBorders>
-          </w:tcPr>
-          <w:p>
-            <w:r/>
-          </w:p>
-        </w:tc>
-        <w:tc>
-          <w:tcPr>
-            <w:tcW w:w="6641" w:type="dxa"/>
-            <w:tcBorders>
-              <w:top w:val="single" w:sz="4" w:space="0" w:color="000000"/>
-              <w:left w:val="single" w:sz="4" w:space="0" w:color="000000"/>
-              <w:bottom w:val="single" w:sz="4" w:space="0" w:color="000000"/>
-              <w:right w:val="single" w:sz="4" w:space="0" w:color="000000"/>
-            </w:tcBorders>
-          </w:tcPr>
-          <w:p>
-            <w:r>
-              <w:t>7. Fluxo alternativo — endereço de correio eletrônico já cadastrado: o sistema informa a duplicidade e mantém a conta existente.</w:t>
+              <w:t>4. O sistema valida os dados — o nome aceita somente letras, inclusive acentuadas, espaço, apóstrofo, hífen e ponto, recusados os números, com até 150 caracteres; o endereço de correio eletrônico admite até 150 caracteres; a unidade federativa aceita duas letras, convertidas em maiúsculas; e o município admite até 100 caracteres —, cria a conta e expede mensagem de boas-vindas com a orientação de configurar o segundo fator no primeiro acesso.</w:t>
+            </w:r>
+          </w:p>
+        </w:tc>
+      </w:tr>
+      <w:tr>
+        <w:tc>
+          <w:tcPr>
+            <w:tcW w:w="2381" w:type="dxa"/>
+            <w:tcBorders>
+              <w:top w:val="single" w:sz="4" w:space="0" w:color="000000"/>
+              <w:left w:val="single" w:sz="4" w:space="0" w:color="000000"/>
+              <w:bottom w:val="single" w:sz="4" w:space="0" w:color="000000"/>
+              <w:right w:val="single" w:sz="4" w:space="0" w:color="000000"/>
+            </w:tcBorders>
+          </w:tcPr>
+          <w:p>
+            <w:r/>
+          </w:p>
+        </w:tc>
+        <w:tc>
+          <w:tcPr>
+            <w:tcW w:w="6641" w:type="dxa"/>
+            <w:tcBorders>
+              <w:top w:val="single" w:sz="4" w:space="0" w:color="000000"/>
+              <w:left w:val="single" w:sz="4" w:space="0" w:color="000000"/>
+              <w:bottom w:val="single" w:sz="4" w:space="0" w:color="000000"/>
+              <w:right w:val="single" w:sz="4" w:space="0" w:color="000000"/>
+            </w:tcBorders>
+          </w:tcPr>
+          <w:p>
+            <w:r>
+              <w:t>5. Fluxo alternativo — nome com números ou outros caracteres não admitidos: o sistema não cria a conta e apresenta, no próprio campo, o aviso “Use só letras no nome.”.</w:t>
+            </w:r>
+          </w:p>
+        </w:tc>
+      </w:tr>
+      <w:tr>
+        <w:tc>
+          <w:tcPr>
+            <w:tcW w:w="2381" w:type="dxa"/>
+            <w:tcBorders>
+              <w:top w:val="single" w:sz="4" w:space="0" w:color="000000"/>
+              <w:left w:val="single" w:sz="4" w:space="0" w:color="000000"/>
+              <w:bottom w:val="single" w:sz="4" w:space="0" w:color="000000"/>
+              <w:right w:val="single" w:sz="4" w:space="0" w:color="000000"/>
+            </w:tcBorders>
+          </w:tcPr>
+          <w:p>
+            <w:r/>
+          </w:p>
+        </w:tc>
+        <w:tc>
+          <w:tcPr>
+            <w:tcW w:w="6641" w:type="dxa"/>
+            <w:tcBorders>
+              <w:top w:val="single" w:sz="4" w:space="0" w:color="000000"/>
+              <w:left w:val="single" w:sz="4" w:space="0" w:color="000000"/>
+              <w:bottom w:val="single" w:sz="4" w:space="0" w:color="000000"/>
+              <w:right w:val="single" w:sz="4" w:space="0" w:color="000000"/>
+            </w:tcBorders>
+          </w:tcPr>
+          <w:p>
+            <w:r>
+              <w:t>6. Fluxo alternativo — perfil de administrador solicitado por administrador municipal: o sistema recusa a operação, privativa do Super Administrador.</w:t>
+            </w:r>
+          </w:p>
+        </w:tc>
+      </w:tr>
+      <w:tr>
+        <w:tc>
+          <w:tcPr>
+            <w:tcW w:w="2381" w:type="dxa"/>
+            <w:tcBorders>
+              <w:top w:val="single" w:sz="4" w:space="0" w:color="000000"/>
+              <w:left w:val="single" w:sz="4" w:space="0" w:color="000000"/>
+              <w:bottom w:val="single" w:sz="4" w:space="0" w:color="000000"/>
+              <w:right w:val="single" w:sz="4" w:space="0" w:color="000000"/>
+            </w:tcBorders>
+          </w:tcPr>
+          <w:p>
+            <w:r/>
+          </w:p>
+        </w:tc>
+        <w:tc>
+          <w:tcPr>
+            <w:tcW w:w="6641" w:type="dxa"/>
+            <w:tcBorders>
+              <w:top w:val="single" w:sz="4" w:space="0" w:color="000000"/>
+              <w:left w:val="single" w:sz="4" w:space="0" w:color="000000"/>
+              <w:bottom w:val="single" w:sz="4" w:space="0" w:color="000000"/>
+              <w:right w:val="single" w:sz="4" w:space="0" w:color="000000"/>
+            </w:tcBorders>
+          </w:tcPr>
+          <w:p>
+            <w:r>
+              <w:t>7. Fluxo alternativo — município diverso do solicitante: o sistema recusa a operação.</w:t>
+            </w:r>
+          </w:p>
+        </w:tc>
+      </w:tr>
+      <w:tr>
+        <w:tc>
+          <w:tcPr>
+            <w:tcW w:w="2381" w:type="dxa"/>
+            <w:tcBorders>
+              <w:top w:val="single" w:sz="4" w:space="0" w:color="000000"/>
+              <w:left w:val="single" w:sz="4" w:space="0" w:color="000000"/>
+              <w:bottom w:val="single" w:sz="4" w:space="0" w:color="000000"/>
+              <w:right w:val="single" w:sz="4" w:space="0" w:color="000000"/>
+            </w:tcBorders>
+          </w:tcPr>
+          <w:p>
+            <w:r/>
+          </w:p>
+        </w:tc>
+        <w:tc>
+          <w:tcPr>
+            <w:tcW w:w="6641" w:type="dxa"/>
+            <w:tcBorders>
+              <w:top w:val="single" w:sz="4" w:space="0" w:color="000000"/>
+              <w:left w:val="single" w:sz="4" w:space="0" w:color="000000"/>
+              <w:bottom w:val="single" w:sz="4" w:space="0" w:color="000000"/>
+              <w:right w:val="single" w:sz="4" w:space="0" w:color="000000"/>
+            </w:tcBorders>
+          </w:tcPr>
+          <w:p>
+            <w:r>
+              <w:t>8. Fluxo alternativo — endereço de correio eletrônico já cadastrado: o sistema informa a duplicidade e mantém a conta existente.</w:t>
             </w:r>
           </w:p>
         </w:tc>

</xml_diff>

<commit_message>
docs: relatório v1.18 com os apontamentos da v1.17 e apêndices atualizados
</commit_message>
<xml_diff>
--- a/ApêndiceC-VisãoFuncional/3.FluxosdeEvento/FalaCidade_FluxosDeEventos_ModuloAdministrarConta_v2.docx
+++ b/ApêndiceC-VisãoFuncional/3.FluxosdeEvento/FalaCidade_FluxosDeEventos_ModuloAdministrarConta_v2.docx
@@ -187,7 +187,7 @@
                 <w:b w:val="0"/>
                 <w:sz w:val="20"/>
               </w:rPr>
-              <w:t>Administrador; Serviço de correio eletrônico</w:t>
+              <w:t>Administrador; Servidor de e-mail</w:t>
             </w:r>
           </w:p>
         </w:tc>
@@ -1334,7 +1334,7 @@
                 <w:b w:val="0"/>
                 <w:sz w:val="20"/>
               </w:rPr>
-              <w:t>Usuário autenticado (qualquer perfil); Celular gateway de SMS</w:t>
+              <w:t>Usuário autenticado (qualquer perfil); Aplicativo de SMS</w:t>
             </w:r>
           </w:p>
         </w:tc>
@@ -1422,7 +1422,7 @@
                 <w:b w:val="0"/>
                 <w:sz w:val="20"/>
               </w:rPr>
-              <w:t>Verificação em duas etapas por SMS ativada; celular confirmado gravado no formato E.164 em campo próprio da conta, distinto do telefone do perfil, e exigido como segundo fator nas autenticações seguintes.</w:t>
+              <w:t>Verificação em duas etapas por SMS ativada; celular confirmado gravado no formato E.164 em campo próprio da conta, distinto do telefone do perfil, e exigido como segundo fator nas autenticações seguintes, conforme o caso de uso “Verificar em duas etapas”, do Módulo Autenticação.</w:t>
             </w:r>
           </w:p>
         </w:tc>

</xml_diff>